<commit_message>
Correcciones finales del artículo
</commit_message>
<xml_diff>
--- a/sifilis_congenita/articulo_maestro.docx
+++ b/sifilis_congenita/articulo_maestro.docx
@@ -155,7 +155,7 @@
         <w:pStyle w:val="Date"/>
       </w:pPr>
       <w:r>
-        <w:t xml:space="preserve">12-08-2026</w:t>
+        <w:t xml:space="preserve">21-08-2026</w:t>
       </w:r>
     </w:p>
     <w:sdt>
@@ -297,13 +297,25 @@
         <w:t xml:space="preserve"> </w:t>
       </w:r>
       <w:r>
-        <w:t xml:space="preserve">sensibilidades mantuvieron la dirección y la interpretación. Entre 250 casos con</w:t>
+        <w:t xml:space="preserve">sensibilidades (exclusión de 2021, exclusión de 2024 y priors alternativos)</w:t>
       </w:r>
       <w:r>
         <w:t xml:space="preserve"> </w:t>
       </w:r>
       <w:r>
-        <w:t xml:space="preserve">datos completos, la OR de control prenatal adecuado para origen extranjero fue</w:t>
+        <w:t xml:space="preserve">mantuvieron la dirección y la interpretación. Entre 250 casos con datos</w:t>
+      </w:r>
+      <w:r>
+        <w:t xml:space="preserve"> </w:t>
+      </w:r>
+      <w:r>
+        <w:t xml:space="preserve">completos, la OR de densidad de control prenatal (clasificación operacional,</w:t>
+      </w:r>
+      <w:r>
+        <w:t xml:space="preserve"> </w:t>
+      </w:r>
+      <w:r>
+        <w:t xml:space="preserve">no una medida universal de adecuación) para origen extranjero fue</w:t>
       </w:r>
       <w:r>
         <w:t xml:space="preserve"> </w:t>
@@ -331,13 +343,19 @@
         <w:t xml:space="preserve"> </w:t>
       </w:r>
       <w:r>
-        <w:t xml:space="preserve">registrada, con resultados robustos a la exclusión de 2021 y a priors razonables.</w:t>
+        <w:t xml:space="preserve">registrada, con resultados robustos a la exclusión de 2021, a la exclusión de</w:t>
       </w:r>
       <w:r>
         <w:t xml:space="preserve"> </w:t>
       </w:r>
       <w:r>
-        <w:t xml:space="preserve">El análisis entre casos no permite evaluar mediación por control prenatal.</w:t>
+        <w:t xml:space="preserve">2024 y a priors razonables. El análisis entre casos no permite evaluar</w:t>
+      </w:r>
+      <w:r>
+        <w:t xml:space="preserve"> </w:t>
+      </w:r>
+      <w:r>
+        <w:t xml:space="preserve">mediación por control prenatal.</w:t>
       </w:r>
     </w:p>
     <w:p>
@@ -1206,6 +1224,42 @@
       <w:r>
         <w:t xml:space="preserve">estrato; valores de Pareto-k ≥0,7 se consideraron potencialmente problemáticos.</w:t>
       </w:r>
+      <w:r>
+        <w:t xml:space="preserve"> </w:t>
+      </w:r>
+      <w:r>
+        <w:t xml:space="preserve">El modelo principal no incluyó covariables maternas individuales (p. ej. edad,</w:t>
+      </w:r>
+      <w:r>
+        <w:t xml:space="preserve"> </w:t>
+      </w:r>
+      <w:r>
+        <w:t xml:space="preserve">gestas previas, control prenatal) como ajuste, porque estas solo están</w:t>
+      </w:r>
+      <w:r>
+        <w:t xml:space="preserve"> </w:t>
+      </w:r>
+      <w:r>
+        <w:t xml:space="preserve">disponibles entre los casos y no existen equivalentes poblacionales en el</w:t>
+      </w:r>
+      <w:r>
+        <w:t xml:space="preserve"> </w:t>
+      </w:r>
+      <w:r>
+        <w:t xml:space="preserve">denominador; la IRR de origen debe interpretarse como una asociación agregada</w:t>
+      </w:r>
+      <w:r>
+        <w:t xml:space="preserve"> </w:t>
+      </w:r>
+      <w:r>
+        <w:t xml:space="preserve">no ajustada por confusores maternos individuales. Los análisis se realizaron</w:t>
+      </w:r>
+      <w:r>
+        <w:t xml:space="preserve"> </w:t>
+      </w:r>
+      <w:r>
+        <w:t xml:space="preserve">en R 4.5.0 con brms 2.23.0 (backend rstan 2.32.7), posterior 1.7.0 y loo 2.8.0.</w:t>
+      </w:r>
     </w:p>
     <w:bookmarkEnd w:id="24"/>
     <w:bookmarkStart w:id="25" w:name="sensibilidades-y-análisis-secundario"/>
@@ -1231,19 +1285,43 @@
         <w:pStyle w:val="FirstParagraph"/>
       </w:pPr>
       <w:r>
-        <w:t xml:space="preserve">Se repitió el modelo excluyendo ambos estratos de 2021. La sensibilidad de priors</w:t>
+        <w:t xml:space="preserve">Se repitió el modelo excluyendo ambos estratos de 2021. Los nacimientos</w:t>
       </w:r>
       <w:r>
         <w:t xml:space="preserve"> </w:t>
       </w:r>
       <w:r>
-        <w:t xml:space="preserve">varió separadamente la desviación estándar del prior de origen (0,5 y 1,5) y la</w:t>
+        <w:t xml:space="preserve">institucionales de 2024 (2.358) fueron marcadamente menores que en todos los</w:t>
       </w:r>
       <w:r>
         <w:t xml:space="preserve"> </w:t>
       </w:r>
       <w:r>
-        <w:t xml:space="preserve">tasa del prior exponencial de</w:t>
+        <w:t xml:space="preserve">años previos desde 2018 (mínimo 3.657), sin que los archivos disponibles</w:t>
+      </w:r>
+      <w:r>
+        <w:t xml:space="preserve"> </w:t>
+      </w:r>
+      <w:r>
+        <w:t xml:space="preserve">permitan confirmar si 2024 correspondió a un año completo o parcial de</w:t>
+      </w:r>
+      <w:r>
+        <w:t xml:space="preserve"> </w:t>
+      </w:r>
+      <w:r>
+        <w:t xml:space="preserve">registro; por ello se repitió también el modelo excluyendo ambos estratos de</w:t>
+      </w:r>
+      <w:r>
+        <w:t xml:space="preserve"> </w:t>
+      </w:r>
+      <w:r>
+        <w:t xml:space="preserve">2024. La sensibilidad de priors varió separadamente la desviación estándar del</w:t>
+      </w:r>
+      <w:r>
+        <w:t xml:space="preserve"> </w:t>
+      </w:r>
+      <w:r>
+        <w:t xml:space="preserve">prior de origen (0,5 y 1,5) y la tasa del prior exponencial de</w:t>
       </w:r>
       <w:r>
         <w:t xml:space="preserve"> </w:t>
@@ -1258,7 +1336,13 @@
         <w:t xml:space="preserve"> </w:t>
       </w:r>
       <w:r>
-        <w:t xml:space="preserve">(0,5 y 2). El análisis logístico de control</w:t>
+        <w:t xml:space="preserve">(0,5 y</w:t>
+      </w:r>
+      <w:r>
+        <w:t xml:space="preserve"> </w:t>
+      </w:r>
+      <w:r>
+        <w:t xml:space="preserve">2). El análisis logístico de control</w:t>
       </w:r>
       <w:r>
         <w:t xml:space="preserve"> </w:t>
@@ -14631,25 +14715,25 @@
         <w:t xml:space="preserve"> </w:t>
       </w:r>
       <w:r>
-        <w:t xml:space="preserve">10 (ICr95% 1–</w:t>
+        <w:t xml:space="preserve">10 (intervalo predictivo posterior del 95%,</w:t>
       </w:r>
       <w:r>
         <w:t xml:space="preserve"> </w:t>
       </w:r>
       <w:r>
-        <w:t xml:space="preserve">29) y P(Yrep≥observado)=</w:t>
+        <w:t xml:space="preserve">IP95%, 1–29) y</w:t>
       </w:r>
       <w:r>
         <w:t xml:space="preserve"> </w:t>
       </w:r>
       <w:r>
-        <w:t xml:space="preserve">0,061. El valor observado se situó en la</w:t>
+        <w:t xml:space="preserve">P(Yrep≥observado)=0,061. El valor observado</w:t>
       </w:r>
       <w:r>
         <w:t xml:space="preserve"> </w:t>
       </w:r>
       <w:r>
-        <w:t xml:space="preserve">cola superior de la distribución predictiva (percentil</w:t>
+        <w:t xml:space="preserve">se situó en la cola superior de la distribución predictiva (percentil</w:t>
       </w:r>
       <w:r>
         <w:t xml:space="preserve"> </w:t>
@@ -14667,7 +14751,19 @@
         <w:t xml:space="preserve"> </w:t>
       </w:r>
       <w:r>
-        <w:t xml:space="preserve">frecuente bajo una tendencia suave.</w:t>
+        <w:t xml:space="preserve">frecuente bajo una tendencia suave. Este resultado describe la coherencia</w:t>
+      </w:r>
+      <w:r>
+        <w:t xml:space="preserve"> </w:t>
+      </w:r>
+      <w:r>
+        <w:t xml:space="preserve">interna del modelo con los datos observados y no debe interpretarse como</w:t>
+      </w:r>
+      <w:r>
+        <w:t xml:space="preserve"> </w:t>
+      </w:r>
+      <w:r>
+        <w:t xml:space="preserve">evidencia de generalización externa.</w:t>
       </w:r>
     </w:p>
     <w:p>
@@ -15985,13 +16081,37 @@
         <w:t xml:space="preserve"> </w:t>
       </w:r>
       <w:r>
-        <w:t xml:space="preserve">1,56–4,43). En las sensibilidades de</w:t>
+        <w:t xml:space="preserve">1,56–4,43). Al excluir ambos estratos</w:t>
       </w:r>
       <w:r>
         <w:t xml:space="preserve"> </w:t>
       </w:r>
       <w:r>
-        <w:t xml:space="preserve">priors, las medianas de IRR variaron entre 2,03 y</w:t>
+        <w:t xml:space="preserve">de 2024, dado que no pudo confirmarse si corresponde a un año completo de</w:t>
+      </w:r>
+      <w:r>
+        <w:t xml:space="preserve"> </w:t>
+      </w:r>
+      <w:r>
+        <w:t xml:space="preserve">registro, la IRR fue 2,32 (ICr95% 1,34–</w:t>
+      </w:r>
+      <w:r>
+        <w:t xml:space="preserve"> </w:t>
+      </w:r>
+      <w:r>
+        <w:t xml:space="preserve">3,85; P[IRR&gt;1]=0,9986), muy similar</w:t>
+      </w:r>
+      <w:r>
+        <w:t xml:space="preserve"> </w:t>
+      </w:r>
+      <w:r>
+        <w:t xml:space="preserve">a la del modelo principal. En las sensibilidades de priors, las medianas de</w:t>
+      </w:r>
+      <w:r>
+        <w:t xml:space="preserve"> </w:t>
+      </w:r>
+      <w:r>
+        <w:t xml:space="preserve">IRR variaron entre 2,03 y</w:t>
       </w:r>
       <w:r>
         <w:t xml:space="preserve"> </w:t>
@@ -16026,7 +16146,7 @@
               <a:graphicData uri="http://schemas.openxmlformats.org/drawingml/2006/picture">
                 <pic:pic>
                   <pic:nvPicPr>
-                    <pic:cNvPr descr="articulo_maestro_files/figures/articulo/figura1_tasas_predicciones.png" id="33" name="Picture"/>
+                    <pic:cNvPr descr="figures/articulo/figura1_tasas_predicciones.png" id="33" name="Picture"/>
                     <pic:cNvPicPr>
                       <a:picLocks noChangeArrowheads="1" noChangeAspect="1"/>
                     </pic:cNvPicPr>
@@ -16081,7 +16201,7 @@
               <a:graphicData uri="http://schemas.openxmlformats.org/drawingml/2006/picture">
                 <pic:pic>
                   <pic:nvPicPr>
-                    <pic:cNvPr descr="articulo_maestro_files/figures/articulo/figura2_estimaciones_principales.png" id="36" name="Picture"/>
+                    <pic:cNvPr descr="figures/articulo/figura2_estimaciones_principales.png" id="36" name="Picture"/>
                     <pic:cNvPicPr>
                       <a:picLocks noChangeArrowheads="1" noChangeAspect="1"/>
                     </pic:cNvPicPr>
@@ -16136,7 +16256,7 @@
               <a:graphicData uri="http://schemas.openxmlformats.org/drawingml/2006/picture">
                 <pic:pic>
                   <pic:nvPicPr>
-                    <pic:cNvPr descr="articulo_maestro_files/figures/articulo/figura3_control_prenatal_origen.png" id="39" name="Picture"/>
+                    <pic:cNvPr descr="figures/articulo/figura3_control_prenatal_origen.png" id="39" name="Picture"/>
                     <pic:cNvPicPr>
                       <a:picLocks noChangeArrowheads="1" noChangeAspect="1"/>
                     </pic:cNvPicPr>
@@ -16214,19 +16334,31 @@
         <w:t xml:space="preserve"> </w:t>
       </w:r>
       <w:r>
-        <w:t xml:space="preserve">y la interpretación se conservaron al excluir 2021 y bajo cambios razonables de</w:t>
+        <w:t xml:space="preserve">y la interpretación se conservaron al excluir 2021, al excluir 2024 y bajo</w:t>
       </w:r>
       <w:r>
         <w:t xml:space="preserve"> </w:t>
       </w:r>
       <w:r>
-        <w:t xml:space="preserve">los priors, mientras que los diagnósticos MCMC y LOO no indicaron dependencia</w:t>
+        <w:t xml:space="preserve">cambios razonables de los priors, mientras que los diagnósticos MCMC y LOO no</w:t>
       </w:r>
       <w:r>
         <w:t xml:space="preserve"> </w:t>
       </w:r>
       <w:r>
-        <w:t xml:space="preserve">crítica de problemas de muestreo o de un único estrato.</w:t>
+        <w:t xml:space="preserve">indicaron dependencia crítica de problemas de muestreo o de un único estrato.</w:t>
+      </w:r>
+      <w:r>
+        <w:t xml:space="preserve"> </w:t>
+      </w:r>
+      <w:r>
+        <w:t xml:space="preserve">Esta consistencia interna no implica que el modelo generalice a otros</w:t>
+      </w:r>
+      <w:r>
+        <w:t xml:space="preserve"> </w:t>
+      </w:r>
+      <w:r>
+        <w:t xml:space="preserve">contextos institucionales.</w:t>
       </w:r>
     </w:p>
     <w:p>
@@ -16310,19 +16442,105 @@
         <w:t xml:space="preserve"> </w:t>
       </w:r>
       <w:r>
-        <w:t xml:space="preserve">grupo, posible dependencia temporal, cambios de cobertura —incluida posible</w:t>
+        <w:t xml:space="preserve">grupo, posible dependencia temporal, cambios de cobertura, una posible</w:t>
       </w:r>
       <w:r>
         <w:t xml:space="preserve"> </w:t>
       </w:r>
       <w:r>
-        <w:t xml:space="preserve">incompletitud de 2024—, covariables individuales solo entre casos y el supuesto</w:t>
+        <w:t xml:space="preserve">incompletitud del año 2024 —cuya exclusión no modificó la dirección ni la</w:t>
       </w:r>
       <w:r>
         <w:t xml:space="preserve"> </w:t>
       </w:r>
       <w:r>
-        <w:t xml:space="preserve">de una función temporal común con una IRR de origen constante.</w:t>
+        <w:t xml:space="preserve">significancia de la IRR—, ausencia de ajuste por confusores maternos</w:t>
+      </w:r>
+      <w:r>
+        <w:t xml:space="preserve"> </w:t>
+      </w:r>
+      <w:r>
+        <w:t xml:space="preserve">individuales en el modelo principal, covariables individuales solo entre casos</w:t>
+      </w:r>
+      <w:r>
+        <w:t xml:space="preserve"> </w:t>
+      </w:r>
+      <w:r>
+        <w:t xml:space="preserve">y el supuesto de una función temporal común con una IRR de origen constante.</w:t>
+      </w:r>
+    </w:p>
+    <w:p>
+      <w:pPr>
+        <w:pStyle w:val="BodyText"/>
+      </w:pPr>
+      <w:r>
+        <w:t xml:space="preserve">Además, la información disponible no permite documentar con certeza varios</w:t>
+      </w:r>
+      <w:r>
+        <w:t xml:space="preserve"> </w:t>
+      </w:r>
+      <w:r>
+        <w:t xml:space="preserve">elementos necesarios para la interpretación epidemiológica plena de las tasas:</w:t>
+      </w:r>
+      <w:r>
+        <w:t xml:space="preserve"> </w:t>
+      </w:r>
+      <w:r>
+        <w:t xml:space="preserve">los criterios diagnósticos de laboratorio o clínicos empleados para definir un</w:t>
+      </w:r>
+      <w:r>
+        <w:t xml:space="preserve"> </w:t>
+      </w:r>
+      <w:r>
+        <w:t xml:space="preserve">caso de sífilis congénita, la correspondencia exacta entre los nacimientos de</w:t>
+      </w:r>
+      <w:r>
+        <w:t xml:space="preserve"> </w:t>
+      </w:r>
+      <w:r>
+        <w:t xml:space="preserve">los casos y los nacimientos institucionales que forman el denominador</w:t>
+      </w:r>
+      <w:r>
+        <w:t xml:space="preserve"> </w:t>
+      </w:r>
+      <w:r>
+        <w:t xml:space="preserve">(incluida la posibilidad de gestantes o neonatos derivados desde otros</w:t>
+      </w:r>
+      <w:r>
+        <w:t xml:space="preserve"> </w:t>
+      </w:r>
+      <w:r>
+        <w:t xml:space="preserve">centros), el manejo de mortinatos en el numerador y el denominador, y la</w:t>
+      </w:r>
+      <w:r>
+        <w:t xml:space="preserve"> </w:t>
+      </w:r>
+      <w:r>
+        <w:t xml:space="preserve">verificación de duplicados a nivel de paciente individual (más allá de la</w:t>
+      </w:r>
+      <w:r>
+        <w:t xml:space="preserve"> </w:t>
+      </w:r>
+      <w:r>
+        <w:t xml:space="preserve">ausencia de años duplicados en la base agregada)</w:t>
+      </w:r>
+      <w:r>
+        <w:t xml:space="preserve"> </w:t>
+      </w:r>
+      <w:r>
+        <w:t xml:space="preserve">[PENDIENTE DE CONFIRMACIÓN POR LOS AUTORES]. Estos elementos no alteran el</w:t>
+      </w:r>
+      <w:r>
+        <w:t xml:space="preserve"> </w:t>
+      </w:r>
+      <w:r>
+        <w:t xml:space="preserve">modelo estadístico ajustado, pero son necesarios para una interpretación</w:t>
+      </w:r>
+      <w:r>
+        <w:t xml:space="preserve"> </w:t>
+      </w:r>
+      <w:r>
+        <w:t xml:space="preserve">epidemiológica completa de las tasas reportadas.</w:t>
       </w:r>
     </w:p>
     <w:bookmarkEnd w:id="42"/>
@@ -16361,13 +16579,19 @@
         <w:t xml:space="preserve"> </w:t>
       </w:r>
       <w:r>
-        <w:t xml:space="preserve">exclusión de 2021 y a priors razonables. Los resultados no establecen causalidad</w:t>
+        <w:t xml:space="preserve">exclusión de 2021, a la exclusión de 2024 y a priors razonables. Los resultados</w:t>
       </w:r>
       <w:r>
         <w:t xml:space="preserve"> </w:t>
       </w:r>
       <w:r>
-        <w:t xml:space="preserve">ni permiten evaluar si el control prenatal media la asociación observada.</w:t>
+        <w:t xml:space="preserve">no establecen causalidad ni permiten evaluar si el control prenatal media la</w:t>
+      </w:r>
+      <w:r>
+        <w:t xml:space="preserve"> </w:t>
+      </w:r>
+      <w:r>
+        <w:t xml:space="preserve">asociación observada.</w:t>
       </w:r>
     </w:p>
     <w:bookmarkEnd w:id="43"/>
@@ -26850,6 +27074,1552 @@
                 <w:color w:val="000000"/>
               </w:rPr>
               <w:t xml:space="preserve">El modelo principal conserva los 32 estratos.</w:t>
+            </w:r>
+          </w:p>
+        </w:tc>
+      </w:tr>
+    </w:tbl>
+    <w:p xmlns:w="http://schemas.openxmlformats.org/wordprocessingml/2006/main" xmlns:wp="http://schemas.openxmlformats.org/drawingml/2006/wordprocessingDrawing" xmlns:r="http://schemas.openxmlformats.org/officeDocument/2006/relationships" xmlns:w14="http://schemas.microsoft.com/office/word/2010/wordml">
+      <w:pPr>
+        <w:pStyle w:val="TableCaption"/>
+        <w:jc w:val="center"/>
+        <w:keepNext/>
+        <w:pBdr>
+          <w:bottom w:val="none" w:sz="0" w:space="0" w:color="000000"/>
+          <w:top w:val="none" w:sz="0" w:space="0" w:color="000000"/>
+          <w:left w:val="none" w:sz="0" w:space="0" w:color="000000"/>
+          <w:right w:val="none" w:sz="0" w:space="0" w:color="000000"/>
+        </w:pBdr>
+        <w:spacing w:after="60" w:before="60" w:line="240"/>
+        <w:ind w:left="60" w:right="60" w:firstLine="0" w:firstLineChars="0"/>
+      </w:pPr>
+      <w:r>
+        <w:t xml:space="preserve">Tabla S4b. Sensibilidad excluyendo ambos estratos de 2024</w:t>
+      </w:r>
+    </w:p>
+    <w:tbl xmlns:w="http://schemas.openxmlformats.org/wordprocessingml/2006/main" xmlns:r="http://schemas.openxmlformats.org/officeDocument/2006/relationships" xmlns:w14="http://schemas.microsoft.com/office/word/2010/wordml" xmlns:wp="http://schemas.openxmlformats.org/drawingml/2006/wordprocessingDrawing" xmlns:a="http://schemas.openxmlformats.org/drawingml/2006/main" xmlns:pic="http://schemas.openxmlformats.org/drawingml/2006/picture">
+      <w:tblPr>
+        <w:tblLayout w:type="fixed"/>
+        <w:jc w:val="center"/>
+        <w:tblLook w:firstRow="1" w:lastRow="0" w:firstColumn="0" w:lastColumn="0" w:noHBand="0" w:noVBand="1"/>
+      </w:tblPr>
+      <w:tblGrid>
+        <w:gridCol w:w="3381"/>
+        <w:gridCol w:w="1557"/>
+        <w:gridCol w:w="1180"/>
+        <w:gridCol w:w="1388"/>
+        <w:gridCol w:w="1503"/>
+        <w:gridCol w:w="1610"/>
+        <w:gridCol w:w="1180"/>
+        <w:gridCol w:w="1463"/>
+        <w:gridCol w:w="1578"/>
+      </w:tblGrid>
+      <w:tr>
+        <w:trPr>
+          <w:trHeight w:val="630" w:hRule="auto"/>
+          <w:tblHeader/>
+        </w:trPr>
+        header1
+        <w:tc>
+          <w:tcPr>
+            <w:tcBorders>
+              <w:bottom w:val="single" w:sz="12" w:space="0" w:color="666666"/>
+              <w:top w:val="single" w:sz="12" w:space="0" w:color="666666"/>
+              <w:left w:val="none" w:sz="0" w:space="0" w:color="000000"/>
+              <w:right w:val="none" w:sz="0" w:space="0" w:color="000000"/>
+            </w:tcBorders>
+            <w:shd w:val="clear" w:color="auto" w:fill="FFFFFF"/>
+            <w:tcMar>
+              <w:top w:w="0" w:type="dxa"/>
+              <w:bottom w:w="0" w:type="dxa"/>
+              <w:left w:w="0" w:type="dxa"/>
+              <w:right w:w="0" w:type="dxa"/>
+            </w:tcMar>
+            <w:vAlign w:val="center"/>
+          </w:tcPr>
+          <w:p>
+            <w:pPr>
+              <w:pStyle w:val="Normal"/>
+              <w:jc w:val="left"/>
+              <w:pBdr>
+                <w:bottom w:val="none" w:sz="0" w:space="0" w:color="000000"/>
+                <w:top w:val="none" w:sz="0" w:space="0" w:color="000000"/>
+                <w:left w:val="none" w:sz="0" w:space="0" w:color="000000"/>
+                <w:right w:val="none" w:sz="0" w:space="0" w:color="000000"/>
+              </w:pBdr>
+              <w:spacing w:after="100" w:before="100" w:line="240"/>
+              <w:ind w:left="100" w:right="100" w:firstLine="0" w:firstLineChars="0"/>
+              <w:rPr>
+                <w:rFonts w:ascii="DejaVu Sans" w:hAnsi="DejaVu Sans" w:eastAsia="DejaVu Sans" w:cs="DejaVu Sans"/>
+                <w:i w:val="false"/>
+                <w:b w:val="false"/>
+                <w:u w:val="none"/>
+                <w:sz w:val="22"/>
+                <w:szCs w:val="22"/>
+                <w:color w:val="000000"/>
+              </w:rPr>
+            </w:pPr>
+            <w:r xmlns:w="http://schemas.openxmlformats.org/wordprocessingml/2006/main" xmlns:wp="http://schemas.openxmlformats.org/drawingml/2006/wordprocessingDrawing" xmlns:r="http://schemas.openxmlformats.org/officeDocument/2006/relationships" xmlns:w14="http://schemas.microsoft.com/office/word/2010/wordml">
+              <w:rPr>
+                <w:rFonts w:ascii="DejaVu Sans" w:hAnsi="DejaVu Sans" w:eastAsia="DejaVu Sans" w:cs="DejaVu Sans"/>
+                <w:i w:val="false"/>
+                <w:b w:val="false"/>
+                <w:u w:val="none"/>
+                <w:sz w:val="22"/>
+                <w:szCs w:val="22"/>
+                <w:color w:val="000000"/>
+              </w:rPr>
+              <w:t xml:space="preserve">modelo</w:t>
+            </w:r>
+          </w:p>
+        </w:tc>
+        <w:tc>
+          <w:tcPr>
+            <w:tcBorders>
+              <w:bottom w:val="single" w:sz="12" w:space="0" w:color="666666"/>
+              <w:top w:val="single" w:sz="12" w:space="0" w:color="666666"/>
+              <w:left w:val="none" w:sz="0" w:space="0" w:color="000000"/>
+              <w:right w:val="none" w:sz="0" w:space="0" w:color="000000"/>
+            </w:tcBorders>
+            <w:shd w:val="clear" w:color="auto" w:fill="FFFFFF"/>
+            <w:tcMar>
+              <w:top w:w="0" w:type="dxa"/>
+              <w:bottom w:w="0" w:type="dxa"/>
+              <w:left w:w="0" w:type="dxa"/>
+              <w:right w:w="0" w:type="dxa"/>
+            </w:tcMar>
+            <w:vAlign w:val="center"/>
+          </w:tcPr>
+          <w:p>
+            <w:pPr>
+              <w:pStyle w:val="Normal"/>
+              <w:jc w:val="right"/>
+              <w:pBdr>
+                <w:bottom w:val="none" w:sz="0" w:space="0" w:color="000000"/>
+                <w:top w:val="none" w:sz="0" w:space="0" w:color="000000"/>
+                <w:left w:val="none" w:sz="0" w:space="0" w:color="000000"/>
+                <w:right w:val="none" w:sz="0" w:space="0" w:color="000000"/>
+              </w:pBdr>
+              <w:spacing w:after="100" w:before="100" w:line="240"/>
+              <w:ind w:left="100" w:right="100" w:firstLine="0" w:firstLineChars="0"/>
+              <w:rPr>
+                <w:rFonts w:ascii="DejaVu Sans" w:hAnsi="DejaVu Sans" w:eastAsia="DejaVu Sans" w:cs="DejaVu Sans"/>
+                <w:i w:val="false"/>
+                <w:b w:val="false"/>
+                <w:u w:val="none"/>
+                <w:sz w:val="22"/>
+                <w:szCs w:val="22"/>
+                <w:color w:val="000000"/>
+              </w:rPr>
+            </w:pPr>
+            <w:r xmlns:w="http://schemas.openxmlformats.org/wordprocessingml/2006/main" xmlns:wp="http://schemas.openxmlformats.org/drawingml/2006/wordprocessingDrawing" xmlns:r="http://schemas.openxmlformats.org/officeDocument/2006/relationships" xmlns:w14="http://schemas.microsoft.com/office/word/2010/wordml">
+              <w:rPr>
+                <w:rFonts w:ascii="DejaVu Sans" w:hAnsi="DejaVu Sans" w:eastAsia="DejaVu Sans" w:cs="DejaVu Sans"/>
+                <w:i w:val="false"/>
+                <w:b w:val="false"/>
+                <w:u w:val="none"/>
+                <w:sz w:val="22"/>
+                <w:szCs w:val="22"/>
+                <w:color w:val="000000"/>
+              </w:rPr>
+              <w:t xml:space="preserve">n_estratos</w:t>
+            </w:r>
+          </w:p>
+        </w:tc>
+        <w:tc>
+          <w:tcPr>
+            <w:tcBorders>
+              <w:bottom w:val="single" w:sz="12" w:space="0" w:color="666666"/>
+              <w:top w:val="single" w:sz="12" w:space="0" w:color="666666"/>
+              <w:left w:val="none" w:sz="0" w:space="0" w:color="000000"/>
+              <w:right w:val="none" w:sz="0" w:space="0" w:color="000000"/>
+            </w:tcBorders>
+            <w:shd w:val="clear" w:color="auto" w:fill="FFFFFF"/>
+            <w:tcMar>
+              <w:top w:w="0" w:type="dxa"/>
+              <w:bottom w:w="0" w:type="dxa"/>
+              <w:left w:w="0" w:type="dxa"/>
+              <w:right w:w="0" w:type="dxa"/>
+            </w:tcMar>
+            <w:vAlign w:val="center"/>
+          </w:tcPr>
+          <w:p>
+            <w:pPr>
+              <w:pStyle w:val="Normal"/>
+              <w:jc w:val="right"/>
+              <w:pBdr>
+                <w:bottom w:val="none" w:sz="0" w:space="0" w:color="000000"/>
+                <w:top w:val="none" w:sz="0" w:space="0" w:color="000000"/>
+                <w:left w:val="none" w:sz="0" w:space="0" w:color="000000"/>
+                <w:right w:val="none" w:sz="0" w:space="0" w:color="000000"/>
+              </w:pBdr>
+              <w:spacing w:after="100" w:before="100" w:line="240"/>
+              <w:ind w:left="100" w:right="100" w:firstLine="0" w:firstLineChars="0"/>
+              <w:rPr>
+                <w:rFonts w:ascii="DejaVu Sans" w:hAnsi="DejaVu Sans" w:eastAsia="DejaVu Sans" w:cs="DejaVu Sans"/>
+                <w:i w:val="false"/>
+                <w:b w:val="false"/>
+                <w:u w:val="none"/>
+                <w:sz w:val="22"/>
+                <w:szCs w:val="22"/>
+                <w:color w:val="000000"/>
+              </w:rPr>
+            </w:pPr>
+            <w:r xmlns:w="http://schemas.openxmlformats.org/wordprocessingml/2006/main" xmlns:wp="http://schemas.openxmlformats.org/drawingml/2006/wordprocessingDrawing" xmlns:r="http://schemas.openxmlformats.org/officeDocument/2006/relationships" xmlns:w14="http://schemas.microsoft.com/office/word/2010/wordml">
+              <w:rPr>
+                <w:rFonts w:ascii="DejaVu Sans" w:hAnsi="DejaVu Sans" w:eastAsia="DejaVu Sans" w:cs="DejaVu Sans"/>
+                <w:i w:val="false"/>
+                <w:b w:val="false"/>
+                <w:u w:val="none"/>
+                <w:sz w:val="22"/>
+                <w:szCs w:val="22"/>
+                <w:color w:val="000000"/>
+              </w:rPr>
+              <w:t xml:space="preserve">IRR</w:t>
+            </w:r>
+          </w:p>
+        </w:tc>
+        <w:tc>
+          <w:tcPr>
+            <w:tcBorders>
+              <w:bottom w:val="single" w:sz="12" w:space="0" w:color="666666"/>
+              <w:top w:val="single" w:sz="12" w:space="0" w:color="666666"/>
+              <w:left w:val="none" w:sz="0" w:space="0" w:color="000000"/>
+              <w:right w:val="none" w:sz="0" w:space="0" w:color="000000"/>
+            </w:tcBorders>
+            <w:shd w:val="clear" w:color="auto" w:fill="FFFFFF"/>
+            <w:tcMar>
+              <w:top w:w="0" w:type="dxa"/>
+              <w:bottom w:w="0" w:type="dxa"/>
+              <w:left w:w="0" w:type="dxa"/>
+              <w:right w:w="0" w:type="dxa"/>
+            </w:tcMar>
+            <w:vAlign w:val="center"/>
+          </w:tcPr>
+          <w:p>
+            <w:pPr>
+              <w:pStyle w:val="Normal"/>
+              <w:jc w:val="right"/>
+              <w:pBdr>
+                <w:bottom w:val="none" w:sz="0" w:space="0" w:color="000000"/>
+                <w:top w:val="none" w:sz="0" w:space="0" w:color="000000"/>
+                <w:left w:val="none" w:sz="0" w:space="0" w:color="000000"/>
+                <w:right w:val="none" w:sz="0" w:space="0" w:color="000000"/>
+              </w:pBdr>
+              <w:spacing w:after="100" w:before="100" w:line="240"/>
+              <w:ind w:left="100" w:right="100" w:firstLine="0" w:firstLineChars="0"/>
+              <w:rPr>
+                <w:rFonts w:ascii="DejaVu Sans" w:hAnsi="DejaVu Sans" w:eastAsia="DejaVu Sans" w:cs="DejaVu Sans"/>
+                <w:i w:val="false"/>
+                <w:b w:val="false"/>
+                <w:u w:val="none"/>
+                <w:sz w:val="22"/>
+                <w:szCs w:val="22"/>
+                <w:color w:val="000000"/>
+              </w:rPr>
+            </w:pPr>
+            <w:r xmlns:w="http://schemas.openxmlformats.org/wordprocessingml/2006/main" xmlns:wp="http://schemas.openxmlformats.org/drawingml/2006/wordprocessingDrawing" xmlns:r="http://schemas.openxmlformats.org/officeDocument/2006/relationships" xmlns:w14="http://schemas.microsoft.com/office/word/2010/wordml">
+              <w:rPr>
+                <w:rFonts w:ascii="DejaVu Sans" w:hAnsi="DejaVu Sans" w:eastAsia="DejaVu Sans" w:cs="DejaVu Sans"/>
+                <w:i w:val="false"/>
+                <w:b w:val="false"/>
+                <w:u w:val="none"/>
+                <w:sz w:val="22"/>
+                <w:szCs w:val="22"/>
+                <w:color w:val="000000"/>
+              </w:rPr>
+              <w:t xml:space="preserve">ICr95_inf</w:t>
+            </w:r>
+          </w:p>
+        </w:tc>
+        <w:tc>
+          <w:tcPr>
+            <w:tcBorders>
+              <w:bottom w:val="single" w:sz="12" w:space="0" w:color="666666"/>
+              <w:top w:val="single" w:sz="12" w:space="0" w:color="666666"/>
+              <w:left w:val="none" w:sz="0" w:space="0" w:color="000000"/>
+              <w:right w:val="none" w:sz="0" w:space="0" w:color="000000"/>
+            </w:tcBorders>
+            <w:shd w:val="clear" w:color="auto" w:fill="FFFFFF"/>
+            <w:tcMar>
+              <w:top w:w="0" w:type="dxa"/>
+              <w:bottom w:w="0" w:type="dxa"/>
+              <w:left w:w="0" w:type="dxa"/>
+              <w:right w:w="0" w:type="dxa"/>
+            </w:tcMar>
+            <w:vAlign w:val="center"/>
+          </w:tcPr>
+          <w:p>
+            <w:pPr>
+              <w:pStyle w:val="Normal"/>
+              <w:jc w:val="right"/>
+              <w:pBdr>
+                <w:bottom w:val="none" w:sz="0" w:space="0" w:color="000000"/>
+                <w:top w:val="none" w:sz="0" w:space="0" w:color="000000"/>
+                <w:left w:val="none" w:sz="0" w:space="0" w:color="000000"/>
+                <w:right w:val="none" w:sz="0" w:space="0" w:color="000000"/>
+              </w:pBdr>
+              <w:spacing w:after="100" w:before="100" w:line="240"/>
+              <w:ind w:left="100" w:right="100" w:firstLine="0" w:firstLineChars="0"/>
+              <w:rPr>
+                <w:rFonts w:ascii="DejaVu Sans" w:hAnsi="DejaVu Sans" w:eastAsia="DejaVu Sans" w:cs="DejaVu Sans"/>
+                <w:i w:val="false"/>
+                <w:b w:val="false"/>
+                <w:u w:val="none"/>
+                <w:sz w:val="22"/>
+                <w:szCs w:val="22"/>
+                <w:color w:val="000000"/>
+              </w:rPr>
+            </w:pPr>
+            <w:r xmlns:w="http://schemas.openxmlformats.org/wordprocessingml/2006/main" xmlns:wp="http://schemas.openxmlformats.org/drawingml/2006/wordprocessingDrawing" xmlns:r="http://schemas.openxmlformats.org/officeDocument/2006/relationships" xmlns:w14="http://schemas.microsoft.com/office/word/2010/wordml">
+              <w:rPr>
+                <w:rFonts w:ascii="DejaVu Sans" w:hAnsi="DejaVu Sans" w:eastAsia="DejaVu Sans" w:cs="DejaVu Sans"/>
+                <w:i w:val="false"/>
+                <w:b w:val="false"/>
+                <w:u w:val="none"/>
+                <w:sz w:val="22"/>
+                <w:szCs w:val="22"/>
+                <w:color w:val="000000"/>
+              </w:rPr>
+              <w:t xml:space="preserve">ICr95_sup</w:t>
+            </w:r>
+          </w:p>
+        </w:tc>
+        <w:tc>
+          <w:tcPr>
+            <w:tcBorders>
+              <w:bottom w:val="single" w:sz="12" w:space="0" w:color="666666"/>
+              <w:top w:val="single" w:sz="12" w:space="0" w:color="666666"/>
+              <w:left w:val="none" w:sz="0" w:space="0" w:color="000000"/>
+              <w:right w:val="none" w:sz="0" w:space="0" w:color="000000"/>
+            </w:tcBorders>
+            <w:shd w:val="clear" w:color="auto" w:fill="FFFFFF"/>
+            <w:tcMar>
+              <w:top w:w="0" w:type="dxa"/>
+              <w:bottom w:w="0" w:type="dxa"/>
+              <w:left w:w="0" w:type="dxa"/>
+              <w:right w:w="0" w:type="dxa"/>
+            </w:tcMar>
+            <w:vAlign w:val="center"/>
+          </w:tcPr>
+          <w:p>
+            <w:pPr>
+              <w:pStyle w:val="Normal"/>
+              <w:jc w:val="right"/>
+              <w:pBdr>
+                <w:bottom w:val="none" w:sz="0" w:space="0" w:color="000000"/>
+                <w:top w:val="none" w:sz="0" w:space="0" w:color="000000"/>
+                <w:left w:val="none" w:sz="0" w:space="0" w:color="000000"/>
+                <w:right w:val="none" w:sz="0" w:space="0" w:color="000000"/>
+              </w:pBdr>
+              <w:spacing w:after="100" w:before="100" w:line="240"/>
+              <w:ind w:left="100" w:right="100" w:firstLine="0" w:firstLineChars="0"/>
+              <w:rPr>
+                <w:rFonts w:ascii="DejaVu Sans" w:hAnsi="DejaVu Sans" w:eastAsia="DejaVu Sans" w:cs="DejaVu Sans"/>
+                <w:i w:val="false"/>
+                <w:b w:val="false"/>
+                <w:u w:val="none"/>
+                <w:sz w:val="22"/>
+                <w:szCs w:val="22"/>
+                <w:color w:val="000000"/>
+              </w:rPr>
+            </w:pPr>
+            <w:r xmlns:w="http://schemas.openxmlformats.org/wordprocessingml/2006/main" xmlns:wp="http://schemas.openxmlformats.org/drawingml/2006/wordprocessingDrawing" xmlns:r="http://schemas.openxmlformats.org/officeDocument/2006/relationships" xmlns:w14="http://schemas.microsoft.com/office/word/2010/wordml">
+              <w:rPr>
+                <w:rFonts w:ascii="DejaVu Sans" w:hAnsi="DejaVu Sans" w:eastAsia="DejaVu Sans" w:cs="DejaVu Sans"/>
+                <w:i w:val="false"/>
+                <w:b w:val="false"/>
+                <w:u w:val="none"/>
+                <w:sz w:val="22"/>
+                <w:szCs w:val="22"/>
+                <w:color w:val="000000"/>
+              </w:rPr>
+              <w:t xml:space="preserve">P_IRR_gt_1</w:t>
+            </w:r>
+          </w:p>
+        </w:tc>
+        <w:tc>
+          <w:tcPr>
+            <w:tcBorders>
+              <w:bottom w:val="single" w:sz="12" w:space="0" w:color="666666"/>
+              <w:top w:val="single" w:sz="12" w:space="0" w:color="666666"/>
+              <w:left w:val="none" w:sz="0" w:space="0" w:color="000000"/>
+              <w:right w:val="none" w:sz="0" w:space="0" w:color="000000"/>
+            </w:tcBorders>
+            <w:shd w:val="clear" w:color="auto" w:fill="FFFFFF"/>
+            <w:tcMar>
+              <w:top w:w="0" w:type="dxa"/>
+              <w:bottom w:w="0" w:type="dxa"/>
+              <w:left w:w="0" w:type="dxa"/>
+              <w:right w:w="0" w:type="dxa"/>
+            </w:tcMar>
+            <w:vAlign w:val="center"/>
+          </w:tcPr>
+          <w:p>
+            <w:pPr>
+              <w:pStyle w:val="Normal"/>
+              <w:jc w:val="right"/>
+              <w:pBdr>
+                <w:bottom w:val="none" w:sz="0" w:space="0" w:color="000000"/>
+                <w:top w:val="none" w:sz="0" w:space="0" w:color="000000"/>
+                <w:left w:val="none" w:sz="0" w:space="0" w:color="000000"/>
+                <w:right w:val="none" w:sz="0" w:space="0" w:color="000000"/>
+              </w:pBdr>
+              <w:spacing w:after="100" w:before="100" w:line="240"/>
+              <w:ind w:left="100" w:right="100" w:firstLine="0" w:firstLineChars="0"/>
+              <w:rPr>
+                <w:rFonts w:ascii="DejaVu Sans" w:hAnsi="DejaVu Sans" w:eastAsia="DejaVu Sans" w:cs="DejaVu Sans"/>
+                <w:i w:val="false"/>
+                <w:b w:val="false"/>
+                <w:u w:val="none"/>
+                <w:sz w:val="22"/>
+                <w:szCs w:val="22"/>
+                <w:color w:val="000000"/>
+              </w:rPr>
+            </w:pPr>
+            <w:r xmlns:w="http://schemas.openxmlformats.org/wordprocessingml/2006/main" xmlns:wp="http://schemas.openxmlformats.org/drawingml/2006/wordprocessingDrawing" xmlns:r="http://schemas.openxmlformats.org/officeDocument/2006/relationships" xmlns:w14="http://schemas.microsoft.com/office/word/2010/wordml">
+              <w:rPr>
+                <w:rFonts w:ascii="DejaVu Sans" w:hAnsi="DejaVu Sans" w:eastAsia="DejaVu Sans" w:cs="DejaVu Sans"/>
+                <w:i w:val="false"/>
+                <w:b w:val="false"/>
+                <w:u w:val="none"/>
+                <w:sz w:val="22"/>
+                <w:szCs w:val="22"/>
+                <w:color w:val="000000"/>
+              </w:rPr>
+              <w:t xml:space="preserve">shape</w:t>
+            </w:r>
+          </w:p>
+        </w:tc>
+        <w:tc>
+          <w:tcPr>
+            <w:tcBorders>
+              <w:bottom w:val="single" w:sz="12" w:space="0" w:color="666666"/>
+              <w:top w:val="single" w:sz="12" w:space="0" w:color="666666"/>
+              <w:left w:val="none" w:sz="0" w:space="0" w:color="000000"/>
+              <w:right w:val="none" w:sz="0" w:space="0" w:color="000000"/>
+            </w:tcBorders>
+            <w:shd w:val="clear" w:color="auto" w:fill="FFFFFF"/>
+            <w:tcMar>
+              <w:top w:w="0" w:type="dxa"/>
+              <w:bottom w:w="0" w:type="dxa"/>
+              <w:left w:w="0" w:type="dxa"/>
+              <w:right w:w="0" w:type="dxa"/>
+            </w:tcMar>
+            <w:vAlign w:val="center"/>
+          </w:tcPr>
+          <w:p>
+            <w:pPr>
+              <w:pStyle w:val="Normal"/>
+              <w:jc w:val="right"/>
+              <w:pBdr>
+                <w:bottom w:val="none" w:sz="0" w:space="0" w:color="000000"/>
+                <w:top w:val="none" w:sz="0" w:space="0" w:color="000000"/>
+                <w:left w:val="none" w:sz="0" w:space="0" w:color="000000"/>
+                <w:right w:val="none" w:sz="0" w:space="0" w:color="000000"/>
+              </w:pBdr>
+              <w:spacing w:after="100" w:before="100" w:line="240"/>
+              <w:ind w:left="100" w:right="100" w:firstLine="0" w:firstLineChars="0"/>
+              <w:rPr>
+                <w:rFonts w:ascii="DejaVu Sans" w:hAnsi="DejaVu Sans" w:eastAsia="DejaVu Sans" w:cs="DejaVu Sans"/>
+                <w:i w:val="false"/>
+                <w:b w:val="false"/>
+                <w:u w:val="none"/>
+                <w:sz w:val="22"/>
+                <w:szCs w:val="22"/>
+                <w:color w:val="000000"/>
+              </w:rPr>
+            </w:pPr>
+            <w:r xmlns:w="http://schemas.openxmlformats.org/wordprocessingml/2006/main" xmlns:wp="http://schemas.openxmlformats.org/drawingml/2006/wordprocessingDrawing" xmlns:r="http://schemas.openxmlformats.org/officeDocument/2006/relationships" xmlns:w14="http://schemas.microsoft.com/office/word/2010/wordml">
+              <w:rPr>
+                <w:rFonts w:ascii="DejaVu Sans" w:hAnsi="DejaVu Sans" w:eastAsia="DejaVu Sans" w:cs="DejaVu Sans"/>
+                <w:i w:val="false"/>
+                <w:b w:val="false"/>
+                <w:u w:val="none"/>
+                <w:sz w:val="22"/>
+                <w:szCs w:val="22"/>
+                <w:color w:val="000000"/>
+              </w:rPr>
+              <w:t xml:space="preserve">shape_inf</w:t>
+            </w:r>
+          </w:p>
+        </w:tc>
+        <w:tc>
+          <w:tcPr>
+            <w:tcBorders>
+              <w:bottom w:val="single" w:sz="12" w:space="0" w:color="666666"/>
+              <w:top w:val="single" w:sz="12" w:space="0" w:color="666666"/>
+              <w:left w:val="none" w:sz="0" w:space="0" w:color="000000"/>
+              <w:right w:val="none" w:sz="0" w:space="0" w:color="000000"/>
+            </w:tcBorders>
+            <w:shd w:val="clear" w:color="auto" w:fill="FFFFFF"/>
+            <w:tcMar>
+              <w:top w:w="0" w:type="dxa"/>
+              <w:bottom w:w="0" w:type="dxa"/>
+              <w:left w:w="0" w:type="dxa"/>
+              <w:right w:w="0" w:type="dxa"/>
+            </w:tcMar>
+            <w:vAlign w:val="center"/>
+          </w:tcPr>
+          <w:p>
+            <w:pPr>
+              <w:pStyle w:val="Normal"/>
+              <w:jc w:val="right"/>
+              <w:pBdr>
+                <w:bottom w:val="none" w:sz="0" w:space="0" w:color="000000"/>
+                <w:top w:val="none" w:sz="0" w:space="0" w:color="000000"/>
+                <w:left w:val="none" w:sz="0" w:space="0" w:color="000000"/>
+                <w:right w:val="none" w:sz="0" w:space="0" w:color="000000"/>
+              </w:pBdr>
+              <w:spacing w:after="100" w:before="100" w:line="240"/>
+              <w:ind w:left="100" w:right="100" w:firstLine="0" w:firstLineChars="0"/>
+              <w:rPr>
+                <w:rFonts w:ascii="DejaVu Sans" w:hAnsi="DejaVu Sans" w:eastAsia="DejaVu Sans" w:cs="DejaVu Sans"/>
+                <w:i w:val="false"/>
+                <w:b w:val="false"/>
+                <w:u w:val="none"/>
+                <w:sz w:val="22"/>
+                <w:szCs w:val="22"/>
+                <w:color w:val="000000"/>
+              </w:rPr>
+            </w:pPr>
+            <w:r xmlns:w="http://schemas.openxmlformats.org/wordprocessingml/2006/main" xmlns:wp="http://schemas.openxmlformats.org/drawingml/2006/wordprocessingDrawing" xmlns:r="http://schemas.openxmlformats.org/officeDocument/2006/relationships" xmlns:w14="http://schemas.microsoft.com/office/word/2010/wordml">
+              <w:rPr>
+                <w:rFonts w:ascii="DejaVu Sans" w:hAnsi="DejaVu Sans" w:eastAsia="DejaVu Sans" w:cs="DejaVu Sans"/>
+                <w:i w:val="false"/>
+                <w:b w:val="false"/>
+                <w:u w:val="none"/>
+                <w:sz w:val="22"/>
+                <w:szCs w:val="22"/>
+                <w:color w:val="000000"/>
+              </w:rPr>
+              <w:t xml:space="preserve">shape_sup</w:t>
+            </w:r>
+          </w:p>
+        </w:tc>
+      </w:tr>
+      <w:tr>
+        <w:trPr>
+          <w:trHeight w:val="624" w:hRule="auto"/>
+        </w:trPr>
+        body1
+        <w:tc>
+          <w:tcPr>
+            <w:tcBorders>
+              <w:bottom w:val="none" w:sz="0" w:space="0" w:color="000000"/>
+              <w:top w:val="single" w:sz="12" w:space="0" w:color="666666"/>
+              <w:left w:val="none" w:sz="0" w:space="0" w:color="000000"/>
+              <w:right w:val="none" w:sz="0" w:space="0" w:color="000000"/>
+            </w:tcBorders>
+            <w:shd w:val="clear" w:color="auto" w:fill="FFFFFF"/>
+            <w:tcMar>
+              <w:top w:w="0" w:type="dxa"/>
+              <w:bottom w:w="0" w:type="dxa"/>
+              <w:left w:w="0" w:type="dxa"/>
+              <w:right w:w="0" w:type="dxa"/>
+            </w:tcMar>
+            <w:vAlign w:val="center"/>
+          </w:tcPr>
+          <w:p>
+            <w:pPr>
+              <w:pStyle w:val="Normal"/>
+              <w:jc w:val="left"/>
+              <w:pBdr>
+                <w:bottom w:val="none" w:sz="0" w:space="0" w:color="000000"/>
+                <w:top w:val="none" w:sz="0" w:space="0" w:color="000000"/>
+                <w:left w:val="none" w:sz="0" w:space="0" w:color="000000"/>
+                <w:right w:val="none" w:sz="0" w:space="0" w:color="000000"/>
+              </w:pBdr>
+              <w:spacing w:after="100" w:before="100" w:line="240"/>
+              <w:ind w:left="100" w:right="100" w:firstLine="0" w:firstLineChars="0"/>
+              <w:rPr>
+                <w:rFonts w:ascii="DejaVu Sans" w:hAnsi="DejaVu Sans" w:eastAsia="DejaVu Sans" w:cs="DejaVu Sans"/>
+                <w:i w:val="false"/>
+                <w:b w:val="false"/>
+                <w:u w:val="none"/>
+                <w:sz w:val="22"/>
+                <w:szCs w:val="22"/>
+                <w:color w:val="000000"/>
+              </w:rPr>
+            </w:pPr>
+            <w:r xmlns:w="http://schemas.openxmlformats.org/wordprocessingml/2006/main" xmlns:wp="http://schemas.openxmlformats.org/drawingml/2006/wordprocessingDrawing" xmlns:r="http://schemas.openxmlformats.org/officeDocument/2006/relationships" xmlns:w14="http://schemas.microsoft.com/office/word/2010/wordml">
+              <w:rPr>
+                <w:rFonts w:ascii="DejaVu Sans" w:hAnsi="DejaVu Sans" w:eastAsia="DejaVu Sans" w:cs="DejaVu Sans"/>
+                <w:i w:val="false"/>
+                <w:b w:val="false"/>
+                <w:u w:val="none"/>
+                <w:sz w:val="22"/>
+                <w:szCs w:val="22"/>
+                <w:color w:val="000000"/>
+              </w:rPr>
+              <w:t xml:space="preserve">Principal</w:t>
+            </w:r>
+          </w:p>
+        </w:tc>
+        <w:tc>
+          <w:tcPr>
+            <w:tcBorders>
+              <w:bottom w:val="none" w:sz="0" w:space="0" w:color="000000"/>
+              <w:top w:val="single" w:sz="12" w:space="0" w:color="666666"/>
+              <w:left w:val="none" w:sz="0" w:space="0" w:color="000000"/>
+              <w:right w:val="none" w:sz="0" w:space="0" w:color="000000"/>
+            </w:tcBorders>
+            <w:shd w:val="clear" w:color="auto" w:fill="FFFFFF"/>
+            <w:tcMar>
+              <w:top w:w="0" w:type="dxa"/>
+              <w:bottom w:w="0" w:type="dxa"/>
+              <w:left w:w="0" w:type="dxa"/>
+              <w:right w:w="0" w:type="dxa"/>
+            </w:tcMar>
+            <w:vAlign w:val="center"/>
+          </w:tcPr>
+          <w:p>
+            <w:pPr>
+              <w:pStyle w:val="Normal"/>
+              <w:jc w:val="right"/>
+              <w:pBdr>
+                <w:bottom w:val="none" w:sz="0" w:space="0" w:color="000000"/>
+                <w:top w:val="none" w:sz="0" w:space="0" w:color="000000"/>
+                <w:left w:val="none" w:sz="0" w:space="0" w:color="000000"/>
+                <w:right w:val="none" w:sz="0" w:space="0" w:color="000000"/>
+              </w:pBdr>
+              <w:spacing w:after="100" w:before="100" w:line="240"/>
+              <w:ind w:left="100" w:right="100" w:firstLine="0" w:firstLineChars="0"/>
+              <w:rPr>
+                <w:rFonts w:ascii="DejaVu Sans" w:hAnsi="DejaVu Sans" w:eastAsia="DejaVu Sans" w:cs="DejaVu Sans"/>
+                <w:i w:val="false"/>
+                <w:b w:val="false"/>
+                <w:u w:val="none"/>
+                <w:sz w:val="22"/>
+                <w:szCs w:val="22"/>
+                <w:color w:val="000000"/>
+              </w:rPr>
+            </w:pPr>
+            <w:r xmlns:w="http://schemas.openxmlformats.org/wordprocessingml/2006/main" xmlns:wp="http://schemas.openxmlformats.org/drawingml/2006/wordprocessingDrawing" xmlns:r="http://schemas.openxmlformats.org/officeDocument/2006/relationships" xmlns:w14="http://schemas.microsoft.com/office/word/2010/wordml">
+              <w:rPr>
+                <w:rFonts w:ascii="DejaVu Sans" w:hAnsi="DejaVu Sans" w:eastAsia="DejaVu Sans" w:cs="DejaVu Sans"/>
+                <w:i w:val="false"/>
+                <w:b w:val="false"/>
+                <w:u w:val="none"/>
+                <w:sz w:val="22"/>
+                <w:szCs w:val="22"/>
+                <w:color w:val="000000"/>
+              </w:rPr>
+              <w:t xml:space="preserve">32</w:t>
+            </w:r>
+          </w:p>
+        </w:tc>
+        <w:tc>
+          <w:tcPr>
+            <w:tcBorders>
+              <w:bottom w:val="none" w:sz="0" w:space="0" w:color="000000"/>
+              <w:top w:val="single" w:sz="12" w:space="0" w:color="666666"/>
+              <w:left w:val="none" w:sz="0" w:space="0" w:color="000000"/>
+              <w:right w:val="none" w:sz="0" w:space="0" w:color="000000"/>
+            </w:tcBorders>
+            <w:shd w:val="clear" w:color="auto" w:fill="FFFFFF"/>
+            <w:tcMar>
+              <w:top w:w="0" w:type="dxa"/>
+              <w:bottom w:w="0" w:type="dxa"/>
+              <w:left w:w="0" w:type="dxa"/>
+              <w:right w:w="0" w:type="dxa"/>
+            </w:tcMar>
+            <w:vAlign w:val="center"/>
+          </w:tcPr>
+          <w:p>
+            <w:pPr>
+              <w:pStyle w:val="Normal"/>
+              <w:jc w:val="right"/>
+              <w:pBdr>
+                <w:bottom w:val="none" w:sz="0" w:space="0" w:color="000000"/>
+                <w:top w:val="none" w:sz="0" w:space="0" w:color="000000"/>
+                <w:left w:val="none" w:sz="0" w:space="0" w:color="000000"/>
+                <w:right w:val="none" w:sz="0" w:space="0" w:color="000000"/>
+              </w:pBdr>
+              <w:spacing w:after="100" w:before="100" w:line="240"/>
+              <w:ind w:left="100" w:right="100" w:firstLine="0" w:firstLineChars="0"/>
+              <w:rPr>
+                <w:rFonts w:ascii="DejaVu Sans" w:hAnsi="DejaVu Sans" w:eastAsia="DejaVu Sans" w:cs="DejaVu Sans"/>
+                <w:i w:val="false"/>
+                <w:b w:val="false"/>
+                <w:u w:val="none"/>
+                <w:sz w:val="22"/>
+                <w:szCs w:val="22"/>
+                <w:color w:val="000000"/>
+              </w:rPr>
+            </w:pPr>
+            <w:r xmlns:w="http://schemas.openxmlformats.org/wordprocessingml/2006/main" xmlns:wp="http://schemas.openxmlformats.org/drawingml/2006/wordprocessingDrawing" xmlns:r="http://schemas.openxmlformats.org/officeDocument/2006/relationships" xmlns:w14="http://schemas.microsoft.com/office/word/2010/wordml">
+              <w:rPr>
+                <w:rFonts w:ascii="DejaVu Sans" w:hAnsi="DejaVu Sans" w:eastAsia="DejaVu Sans" w:cs="DejaVu Sans"/>
+                <w:i w:val="false"/>
+                <w:b w:val="false"/>
+                <w:u w:val="none"/>
+                <w:sz w:val="22"/>
+                <w:szCs w:val="22"/>
+                <w:color w:val="000000"/>
+              </w:rPr>
+              <w:t xml:space="preserve">2.3718</w:t>
+            </w:r>
+          </w:p>
+        </w:tc>
+        <w:tc>
+          <w:tcPr>
+            <w:tcBorders>
+              <w:bottom w:val="none" w:sz="0" w:space="0" w:color="000000"/>
+              <w:top w:val="single" w:sz="12" w:space="0" w:color="666666"/>
+              <w:left w:val="none" w:sz="0" w:space="0" w:color="000000"/>
+              <w:right w:val="none" w:sz="0" w:space="0" w:color="000000"/>
+            </w:tcBorders>
+            <w:shd w:val="clear" w:color="auto" w:fill="FFFFFF"/>
+            <w:tcMar>
+              <w:top w:w="0" w:type="dxa"/>
+              <w:bottom w:w="0" w:type="dxa"/>
+              <w:left w:w="0" w:type="dxa"/>
+              <w:right w:w="0" w:type="dxa"/>
+            </w:tcMar>
+            <w:vAlign w:val="center"/>
+          </w:tcPr>
+          <w:p>
+            <w:pPr>
+              <w:pStyle w:val="Normal"/>
+              <w:jc w:val="right"/>
+              <w:pBdr>
+                <w:bottom w:val="none" w:sz="0" w:space="0" w:color="000000"/>
+                <w:top w:val="none" w:sz="0" w:space="0" w:color="000000"/>
+                <w:left w:val="none" w:sz="0" w:space="0" w:color="000000"/>
+                <w:right w:val="none" w:sz="0" w:space="0" w:color="000000"/>
+              </w:pBdr>
+              <w:spacing w:after="100" w:before="100" w:line="240"/>
+              <w:ind w:left="100" w:right="100" w:firstLine="0" w:firstLineChars="0"/>
+              <w:rPr>
+                <w:rFonts w:ascii="DejaVu Sans" w:hAnsi="DejaVu Sans" w:eastAsia="DejaVu Sans" w:cs="DejaVu Sans"/>
+                <w:i w:val="false"/>
+                <w:b w:val="false"/>
+                <w:u w:val="none"/>
+                <w:sz w:val="22"/>
+                <w:szCs w:val="22"/>
+                <w:color w:val="000000"/>
+              </w:rPr>
+            </w:pPr>
+            <w:r xmlns:w="http://schemas.openxmlformats.org/wordprocessingml/2006/main" xmlns:wp="http://schemas.openxmlformats.org/drawingml/2006/wordprocessingDrawing" xmlns:r="http://schemas.openxmlformats.org/officeDocument/2006/relationships" xmlns:w14="http://schemas.microsoft.com/office/word/2010/wordml">
+              <w:rPr>
+                <w:rFonts w:ascii="DejaVu Sans" w:hAnsi="DejaVu Sans" w:eastAsia="DejaVu Sans" w:cs="DejaVu Sans"/>
+                <w:i w:val="false"/>
+                <w:b w:val="false"/>
+                <w:u w:val="none"/>
+                <w:sz w:val="22"/>
+                <w:szCs w:val="22"/>
+                <w:color w:val="000000"/>
+              </w:rPr>
+              <w:t xml:space="preserve">1.4184</w:t>
+            </w:r>
+          </w:p>
+        </w:tc>
+        <w:tc>
+          <w:tcPr>
+            <w:tcBorders>
+              <w:bottom w:val="none" w:sz="0" w:space="0" w:color="000000"/>
+              <w:top w:val="single" w:sz="12" w:space="0" w:color="666666"/>
+              <w:left w:val="none" w:sz="0" w:space="0" w:color="000000"/>
+              <w:right w:val="none" w:sz="0" w:space="0" w:color="000000"/>
+            </w:tcBorders>
+            <w:shd w:val="clear" w:color="auto" w:fill="FFFFFF"/>
+            <w:tcMar>
+              <w:top w:w="0" w:type="dxa"/>
+              <w:bottom w:w="0" w:type="dxa"/>
+              <w:left w:w="0" w:type="dxa"/>
+              <w:right w:w="0" w:type="dxa"/>
+            </w:tcMar>
+            <w:vAlign w:val="center"/>
+          </w:tcPr>
+          <w:p>
+            <w:pPr>
+              <w:pStyle w:val="Normal"/>
+              <w:jc w:val="right"/>
+              <w:pBdr>
+                <w:bottom w:val="none" w:sz="0" w:space="0" w:color="000000"/>
+                <w:top w:val="none" w:sz="0" w:space="0" w:color="000000"/>
+                <w:left w:val="none" w:sz="0" w:space="0" w:color="000000"/>
+                <w:right w:val="none" w:sz="0" w:space="0" w:color="000000"/>
+              </w:pBdr>
+              <w:spacing w:after="100" w:before="100" w:line="240"/>
+              <w:ind w:left="100" w:right="100" w:firstLine="0" w:firstLineChars="0"/>
+              <w:rPr>
+                <w:rFonts w:ascii="DejaVu Sans" w:hAnsi="DejaVu Sans" w:eastAsia="DejaVu Sans" w:cs="DejaVu Sans"/>
+                <w:i w:val="false"/>
+                <w:b w:val="false"/>
+                <w:u w:val="none"/>
+                <w:sz w:val="22"/>
+                <w:szCs w:val="22"/>
+                <w:color w:val="000000"/>
+              </w:rPr>
+            </w:pPr>
+            <w:r xmlns:w="http://schemas.openxmlformats.org/wordprocessingml/2006/main" xmlns:wp="http://schemas.openxmlformats.org/drawingml/2006/wordprocessingDrawing" xmlns:r="http://schemas.openxmlformats.org/officeDocument/2006/relationships" xmlns:w14="http://schemas.microsoft.com/office/word/2010/wordml">
+              <w:rPr>
+                <w:rFonts w:ascii="DejaVu Sans" w:hAnsi="DejaVu Sans" w:eastAsia="DejaVu Sans" w:cs="DejaVu Sans"/>
+                <w:i w:val="false"/>
+                <w:b w:val="false"/>
+                <w:u w:val="none"/>
+                <w:sz w:val="22"/>
+                <w:szCs w:val="22"/>
+                <w:color w:val="000000"/>
+              </w:rPr>
+              <w:t xml:space="preserve">3.9896</w:t>
+            </w:r>
+          </w:p>
+        </w:tc>
+        <w:tc>
+          <w:tcPr>
+            <w:tcBorders>
+              <w:bottom w:val="none" w:sz="0" w:space="0" w:color="000000"/>
+              <w:top w:val="single" w:sz="12" w:space="0" w:color="666666"/>
+              <w:left w:val="none" w:sz="0" w:space="0" w:color="000000"/>
+              <w:right w:val="none" w:sz="0" w:space="0" w:color="000000"/>
+            </w:tcBorders>
+            <w:shd w:val="clear" w:color="auto" w:fill="FFFFFF"/>
+            <w:tcMar>
+              <w:top w:w="0" w:type="dxa"/>
+              <w:bottom w:w="0" w:type="dxa"/>
+              <w:left w:w="0" w:type="dxa"/>
+              <w:right w:w="0" w:type="dxa"/>
+            </w:tcMar>
+            <w:vAlign w:val="center"/>
+          </w:tcPr>
+          <w:p>
+            <w:pPr>
+              <w:pStyle w:val="Normal"/>
+              <w:jc w:val="right"/>
+              <w:pBdr>
+                <w:bottom w:val="none" w:sz="0" w:space="0" w:color="000000"/>
+                <w:top w:val="none" w:sz="0" w:space="0" w:color="000000"/>
+                <w:left w:val="none" w:sz="0" w:space="0" w:color="000000"/>
+                <w:right w:val="none" w:sz="0" w:space="0" w:color="000000"/>
+              </w:pBdr>
+              <w:spacing w:after="100" w:before="100" w:line="240"/>
+              <w:ind w:left="100" w:right="100" w:firstLine="0" w:firstLineChars="0"/>
+              <w:rPr>
+                <w:rFonts w:ascii="DejaVu Sans" w:hAnsi="DejaVu Sans" w:eastAsia="DejaVu Sans" w:cs="DejaVu Sans"/>
+                <w:i w:val="false"/>
+                <w:b w:val="false"/>
+                <w:u w:val="none"/>
+                <w:sz w:val="22"/>
+                <w:szCs w:val="22"/>
+                <w:color w:val="000000"/>
+              </w:rPr>
+            </w:pPr>
+            <w:r xmlns:w="http://schemas.openxmlformats.org/wordprocessingml/2006/main" xmlns:wp="http://schemas.openxmlformats.org/drawingml/2006/wordprocessingDrawing" xmlns:r="http://schemas.openxmlformats.org/officeDocument/2006/relationships" xmlns:w14="http://schemas.microsoft.com/office/word/2010/wordml">
+              <w:rPr>
+                <w:rFonts w:ascii="DejaVu Sans" w:hAnsi="DejaVu Sans" w:eastAsia="DejaVu Sans" w:cs="DejaVu Sans"/>
+                <w:i w:val="false"/>
+                <w:b w:val="false"/>
+                <w:u w:val="none"/>
+                <w:sz w:val="22"/>
+                <w:szCs w:val="22"/>
+                <w:color w:val="000000"/>
+              </w:rPr>
+              <w:t xml:space="preserve">0.9988</w:t>
+            </w:r>
+          </w:p>
+        </w:tc>
+        <w:tc>
+          <w:tcPr>
+            <w:tcBorders>
+              <w:bottom w:val="none" w:sz="0" w:space="0" w:color="000000"/>
+              <w:top w:val="single" w:sz="12" w:space="0" w:color="666666"/>
+              <w:left w:val="none" w:sz="0" w:space="0" w:color="000000"/>
+              <w:right w:val="none" w:sz="0" w:space="0" w:color="000000"/>
+            </w:tcBorders>
+            <w:shd w:val="clear" w:color="auto" w:fill="FFFFFF"/>
+            <w:tcMar>
+              <w:top w:w="0" w:type="dxa"/>
+              <w:bottom w:w="0" w:type="dxa"/>
+              <w:left w:w="0" w:type="dxa"/>
+              <w:right w:w="0" w:type="dxa"/>
+            </w:tcMar>
+            <w:vAlign w:val="center"/>
+          </w:tcPr>
+          <w:p>
+            <w:pPr>
+              <w:pStyle w:val="Normal"/>
+              <w:jc w:val="right"/>
+              <w:pBdr>
+                <w:bottom w:val="none" w:sz="0" w:space="0" w:color="000000"/>
+                <w:top w:val="none" w:sz="0" w:space="0" w:color="000000"/>
+                <w:left w:val="none" w:sz="0" w:space="0" w:color="000000"/>
+                <w:right w:val="none" w:sz="0" w:space="0" w:color="000000"/>
+              </w:pBdr>
+              <w:spacing w:after="100" w:before="100" w:line="240"/>
+              <w:ind w:left="100" w:right="100" w:firstLine="0" w:firstLineChars="0"/>
+              <w:rPr>
+                <w:rFonts w:ascii="DejaVu Sans" w:hAnsi="DejaVu Sans" w:eastAsia="DejaVu Sans" w:cs="DejaVu Sans"/>
+                <w:i w:val="false"/>
+                <w:b w:val="false"/>
+                <w:u w:val="none"/>
+                <w:sz w:val="22"/>
+                <w:szCs w:val="22"/>
+                <w:color w:val="000000"/>
+              </w:rPr>
+            </w:pPr>
+            <w:r xmlns:w="http://schemas.openxmlformats.org/wordprocessingml/2006/main" xmlns:wp="http://schemas.openxmlformats.org/drawingml/2006/wordprocessingDrawing" xmlns:r="http://schemas.openxmlformats.org/officeDocument/2006/relationships" xmlns:w14="http://schemas.microsoft.com/office/word/2010/wordml">
+              <w:rPr>
+                <w:rFonts w:ascii="DejaVu Sans" w:hAnsi="DejaVu Sans" w:eastAsia="DejaVu Sans" w:cs="DejaVu Sans"/>
+                <w:i w:val="false"/>
+                <w:b w:val="false"/>
+                <w:u w:val="none"/>
+                <w:sz w:val="22"/>
+                <w:szCs w:val="22"/>
+                <w:color w:val="000000"/>
+              </w:rPr>
+              <w:t xml:space="preserve">4.0072</w:t>
+            </w:r>
+          </w:p>
+        </w:tc>
+        <w:tc>
+          <w:tcPr>
+            <w:tcBorders>
+              <w:bottom w:val="none" w:sz="0" w:space="0" w:color="000000"/>
+              <w:top w:val="single" w:sz="12" w:space="0" w:color="666666"/>
+              <w:left w:val="none" w:sz="0" w:space="0" w:color="000000"/>
+              <w:right w:val="none" w:sz="0" w:space="0" w:color="000000"/>
+            </w:tcBorders>
+            <w:shd w:val="clear" w:color="auto" w:fill="FFFFFF"/>
+            <w:tcMar>
+              <w:top w:w="0" w:type="dxa"/>
+              <w:bottom w:w="0" w:type="dxa"/>
+              <w:left w:w="0" w:type="dxa"/>
+              <w:right w:w="0" w:type="dxa"/>
+            </w:tcMar>
+            <w:vAlign w:val="center"/>
+          </w:tcPr>
+          <w:p>
+            <w:pPr>
+              <w:pStyle w:val="Normal"/>
+              <w:jc w:val="right"/>
+              <w:pBdr>
+                <w:bottom w:val="none" w:sz="0" w:space="0" w:color="000000"/>
+                <w:top w:val="none" w:sz="0" w:space="0" w:color="000000"/>
+                <w:left w:val="none" w:sz="0" w:space="0" w:color="000000"/>
+                <w:right w:val="none" w:sz="0" w:space="0" w:color="000000"/>
+              </w:pBdr>
+              <w:spacing w:after="100" w:before="100" w:line="240"/>
+              <w:ind w:left="100" w:right="100" w:firstLine="0" w:firstLineChars="0"/>
+              <w:rPr>
+                <w:rFonts w:ascii="DejaVu Sans" w:hAnsi="DejaVu Sans" w:eastAsia="DejaVu Sans" w:cs="DejaVu Sans"/>
+                <w:i w:val="false"/>
+                <w:b w:val="false"/>
+                <w:u w:val="none"/>
+                <w:sz w:val="22"/>
+                <w:szCs w:val="22"/>
+                <w:color w:val="000000"/>
+              </w:rPr>
+            </w:pPr>
+            <w:r xmlns:w="http://schemas.openxmlformats.org/wordprocessingml/2006/main" xmlns:wp="http://schemas.openxmlformats.org/drawingml/2006/wordprocessingDrawing" xmlns:r="http://schemas.openxmlformats.org/officeDocument/2006/relationships" xmlns:w14="http://schemas.microsoft.com/office/word/2010/wordml">
+              <w:rPr>
+                <w:rFonts w:ascii="DejaVu Sans" w:hAnsi="DejaVu Sans" w:eastAsia="DejaVu Sans" w:cs="DejaVu Sans"/>
+                <w:i w:val="false"/>
+                <w:b w:val="false"/>
+                <w:u w:val="none"/>
+                <w:sz w:val="22"/>
+                <w:szCs w:val="22"/>
+                <w:color w:val="000000"/>
+              </w:rPr>
+              <w:t xml:space="preserve">2.0079</w:t>
+            </w:r>
+          </w:p>
+        </w:tc>
+        <w:tc>
+          <w:tcPr>
+            <w:tcBorders>
+              <w:bottom w:val="none" w:sz="0" w:space="0" w:color="000000"/>
+              <w:top w:val="single" w:sz="12" w:space="0" w:color="666666"/>
+              <w:left w:val="none" w:sz="0" w:space="0" w:color="000000"/>
+              <w:right w:val="none" w:sz="0" w:space="0" w:color="000000"/>
+            </w:tcBorders>
+            <w:shd w:val="clear" w:color="auto" w:fill="FFFFFF"/>
+            <w:tcMar>
+              <w:top w:w="0" w:type="dxa"/>
+              <w:bottom w:w="0" w:type="dxa"/>
+              <w:left w:w="0" w:type="dxa"/>
+              <w:right w:w="0" w:type="dxa"/>
+            </w:tcMar>
+            <w:vAlign w:val="center"/>
+          </w:tcPr>
+          <w:p>
+            <w:pPr>
+              <w:pStyle w:val="Normal"/>
+              <w:jc w:val="right"/>
+              <w:pBdr>
+                <w:bottom w:val="none" w:sz="0" w:space="0" w:color="000000"/>
+                <w:top w:val="none" w:sz="0" w:space="0" w:color="000000"/>
+                <w:left w:val="none" w:sz="0" w:space="0" w:color="000000"/>
+                <w:right w:val="none" w:sz="0" w:space="0" w:color="000000"/>
+              </w:pBdr>
+              <w:spacing w:after="100" w:before="100" w:line="240"/>
+              <w:ind w:left="100" w:right="100" w:firstLine="0" w:firstLineChars="0"/>
+              <w:rPr>
+                <w:rFonts w:ascii="DejaVu Sans" w:hAnsi="DejaVu Sans" w:eastAsia="DejaVu Sans" w:cs="DejaVu Sans"/>
+                <w:i w:val="false"/>
+                <w:b w:val="false"/>
+                <w:u w:val="none"/>
+                <w:sz w:val="22"/>
+                <w:szCs w:val="22"/>
+                <w:color w:val="000000"/>
+              </w:rPr>
+            </w:pPr>
+            <w:r xmlns:w="http://schemas.openxmlformats.org/wordprocessingml/2006/main" xmlns:wp="http://schemas.openxmlformats.org/drawingml/2006/wordprocessingDrawing" xmlns:r="http://schemas.openxmlformats.org/officeDocument/2006/relationships" xmlns:w14="http://schemas.microsoft.com/office/word/2010/wordml">
+              <w:rPr>
+                <w:rFonts w:ascii="DejaVu Sans" w:hAnsi="DejaVu Sans" w:eastAsia="DejaVu Sans" w:cs="DejaVu Sans"/>
+                <w:i w:val="false"/>
+                <w:b w:val="false"/>
+                <w:u w:val="none"/>
+                <w:sz w:val="22"/>
+                <w:szCs w:val="22"/>
+                <w:color w:val="000000"/>
+              </w:rPr>
+              <w:t xml:space="preserve">7.5087</w:t>
+            </w:r>
+          </w:p>
+        </w:tc>
+      </w:tr>
+      <w:tr>
+        <w:trPr>
+          <w:trHeight w:val="632" w:hRule="auto"/>
+        </w:trPr>
+        body2
+        <w:tc>
+          <w:tcPr>
+            <w:tcBorders>
+              <w:bottom w:val="single" w:sz="12" w:space="0" w:color="666666"/>
+              <w:top w:val="none" w:sz="0" w:space="0" w:color="000000"/>
+              <w:left w:val="none" w:sz="0" w:space="0" w:color="000000"/>
+              <w:right w:val="none" w:sz="0" w:space="0" w:color="000000"/>
+            </w:tcBorders>
+            <w:shd w:val="clear" w:color="auto" w:fill="FFFFFF"/>
+            <w:tcMar>
+              <w:top w:w="0" w:type="dxa"/>
+              <w:bottom w:w="0" w:type="dxa"/>
+              <w:left w:w="0" w:type="dxa"/>
+              <w:right w:w="0" w:type="dxa"/>
+            </w:tcMar>
+            <w:vAlign w:val="center"/>
+          </w:tcPr>
+          <w:p>
+            <w:pPr>
+              <w:pStyle w:val="Normal"/>
+              <w:jc w:val="left"/>
+              <w:pBdr>
+                <w:bottom w:val="none" w:sz="0" w:space="0" w:color="000000"/>
+                <w:top w:val="none" w:sz="0" w:space="0" w:color="000000"/>
+                <w:left w:val="none" w:sz="0" w:space="0" w:color="000000"/>
+                <w:right w:val="none" w:sz="0" w:space="0" w:color="000000"/>
+              </w:pBdr>
+              <w:spacing w:after="100" w:before="100" w:line="240"/>
+              <w:ind w:left="100" w:right="100" w:firstLine="0" w:firstLineChars="0"/>
+              <w:rPr>
+                <w:rFonts w:ascii="DejaVu Sans" w:hAnsi="DejaVu Sans" w:eastAsia="DejaVu Sans" w:cs="DejaVu Sans"/>
+                <w:i w:val="false"/>
+                <w:b w:val="false"/>
+                <w:u w:val="none"/>
+                <w:sz w:val="22"/>
+                <w:szCs w:val="22"/>
+                <w:color w:val="000000"/>
+              </w:rPr>
+            </w:pPr>
+            <w:r xmlns:w="http://schemas.openxmlformats.org/wordprocessingml/2006/main" xmlns:wp="http://schemas.openxmlformats.org/drawingml/2006/wordprocessingDrawing" xmlns:r="http://schemas.openxmlformats.org/officeDocument/2006/relationships" xmlns:w14="http://schemas.microsoft.com/office/word/2010/wordml">
+              <w:rPr>
+                <w:rFonts w:ascii="DejaVu Sans" w:hAnsi="DejaVu Sans" w:eastAsia="DejaVu Sans" w:cs="DejaVu Sans"/>
+                <w:i w:val="false"/>
+                <w:b w:val="false"/>
+                <w:u w:val="none"/>
+                <w:sz w:val="22"/>
+                <w:szCs w:val="22"/>
+                <w:color w:val="000000"/>
+              </w:rPr>
+              <w:t xml:space="preserve">Sin 2024 (ambos orígenes)</w:t>
+            </w:r>
+          </w:p>
+        </w:tc>
+        <w:tc>
+          <w:tcPr>
+            <w:tcBorders>
+              <w:bottom w:val="single" w:sz="12" w:space="0" w:color="666666"/>
+              <w:top w:val="none" w:sz="0" w:space="0" w:color="000000"/>
+              <w:left w:val="none" w:sz="0" w:space="0" w:color="000000"/>
+              <w:right w:val="none" w:sz="0" w:space="0" w:color="000000"/>
+            </w:tcBorders>
+            <w:shd w:val="clear" w:color="auto" w:fill="FFFFFF"/>
+            <w:tcMar>
+              <w:top w:w="0" w:type="dxa"/>
+              <w:bottom w:w="0" w:type="dxa"/>
+              <w:left w:w="0" w:type="dxa"/>
+              <w:right w:w="0" w:type="dxa"/>
+            </w:tcMar>
+            <w:vAlign w:val="center"/>
+          </w:tcPr>
+          <w:p>
+            <w:pPr>
+              <w:pStyle w:val="Normal"/>
+              <w:jc w:val="right"/>
+              <w:pBdr>
+                <w:bottom w:val="none" w:sz="0" w:space="0" w:color="000000"/>
+                <w:top w:val="none" w:sz="0" w:space="0" w:color="000000"/>
+                <w:left w:val="none" w:sz="0" w:space="0" w:color="000000"/>
+                <w:right w:val="none" w:sz="0" w:space="0" w:color="000000"/>
+              </w:pBdr>
+              <w:spacing w:after="100" w:before="100" w:line="240"/>
+              <w:ind w:left="100" w:right="100" w:firstLine="0" w:firstLineChars="0"/>
+              <w:rPr>
+                <w:rFonts w:ascii="DejaVu Sans" w:hAnsi="DejaVu Sans" w:eastAsia="DejaVu Sans" w:cs="DejaVu Sans"/>
+                <w:i w:val="false"/>
+                <w:b w:val="false"/>
+                <w:u w:val="none"/>
+                <w:sz w:val="22"/>
+                <w:szCs w:val="22"/>
+                <w:color w:val="000000"/>
+              </w:rPr>
+            </w:pPr>
+            <w:r xmlns:w="http://schemas.openxmlformats.org/wordprocessingml/2006/main" xmlns:wp="http://schemas.openxmlformats.org/drawingml/2006/wordprocessingDrawing" xmlns:r="http://schemas.openxmlformats.org/officeDocument/2006/relationships" xmlns:w14="http://schemas.microsoft.com/office/word/2010/wordml">
+              <w:rPr>
+                <w:rFonts w:ascii="DejaVu Sans" w:hAnsi="DejaVu Sans" w:eastAsia="DejaVu Sans" w:cs="DejaVu Sans"/>
+                <w:i w:val="false"/>
+                <w:b w:val="false"/>
+                <w:u w:val="none"/>
+                <w:sz w:val="22"/>
+                <w:szCs w:val="22"/>
+                <w:color w:val="000000"/>
+              </w:rPr>
+              <w:t xml:space="preserve">30</w:t>
+            </w:r>
+          </w:p>
+        </w:tc>
+        <w:tc>
+          <w:tcPr>
+            <w:tcBorders>
+              <w:bottom w:val="single" w:sz="12" w:space="0" w:color="666666"/>
+              <w:top w:val="none" w:sz="0" w:space="0" w:color="000000"/>
+              <w:left w:val="none" w:sz="0" w:space="0" w:color="000000"/>
+              <w:right w:val="none" w:sz="0" w:space="0" w:color="000000"/>
+            </w:tcBorders>
+            <w:shd w:val="clear" w:color="auto" w:fill="FFFFFF"/>
+            <w:tcMar>
+              <w:top w:w="0" w:type="dxa"/>
+              <w:bottom w:w="0" w:type="dxa"/>
+              <w:left w:w="0" w:type="dxa"/>
+              <w:right w:w="0" w:type="dxa"/>
+            </w:tcMar>
+            <w:vAlign w:val="center"/>
+          </w:tcPr>
+          <w:p>
+            <w:pPr>
+              <w:pStyle w:val="Normal"/>
+              <w:jc w:val="right"/>
+              <w:pBdr>
+                <w:bottom w:val="none" w:sz="0" w:space="0" w:color="000000"/>
+                <w:top w:val="none" w:sz="0" w:space="0" w:color="000000"/>
+                <w:left w:val="none" w:sz="0" w:space="0" w:color="000000"/>
+                <w:right w:val="none" w:sz="0" w:space="0" w:color="000000"/>
+              </w:pBdr>
+              <w:spacing w:after="100" w:before="100" w:line="240"/>
+              <w:ind w:left="100" w:right="100" w:firstLine="0" w:firstLineChars="0"/>
+              <w:rPr>
+                <w:rFonts w:ascii="DejaVu Sans" w:hAnsi="DejaVu Sans" w:eastAsia="DejaVu Sans" w:cs="DejaVu Sans"/>
+                <w:i w:val="false"/>
+                <w:b w:val="false"/>
+                <w:u w:val="none"/>
+                <w:sz w:val="22"/>
+                <w:szCs w:val="22"/>
+                <w:color w:val="000000"/>
+              </w:rPr>
+            </w:pPr>
+            <w:r xmlns:w="http://schemas.openxmlformats.org/wordprocessingml/2006/main" xmlns:wp="http://schemas.openxmlformats.org/drawingml/2006/wordprocessingDrawing" xmlns:r="http://schemas.openxmlformats.org/officeDocument/2006/relationships" xmlns:w14="http://schemas.microsoft.com/office/word/2010/wordml">
+              <w:rPr>
+                <w:rFonts w:ascii="DejaVu Sans" w:hAnsi="DejaVu Sans" w:eastAsia="DejaVu Sans" w:cs="DejaVu Sans"/>
+                <w:i w:val="false"/>
+                <w:b w:val="false"/>
+                <w:u w:val="none"/>
+                <w:sz w:val="22"/>
+                <w:szCs w:val="22"/>
+                <w:color w:val="000000"/>
+              </w:rPr>
+              <w:t xml:space="preserve">2.3164</w:t>
+            </w:r>
+          </w:p>
+        </w:tc>
+        <w:tc>
+          <w:tcPr>
+            <w:tcBorders>
+              <w:bottom w:val="single" w:sz="12" w:space="0" w:color="666666"/>
+              <w:top w:val="none" w:sz="0" w:space="0" w:color="000000"/>
+              <w:left w:val="none" w:sz="0" w:space="0" w:color="000000"/>
+              <w:right w:val="none" w:sz="0" w:space="0" w:color="000000"/>
+            </w:tcBorders>
+            <w:shd w:val="clear" w:color="auto" w:fill="FFFFFF"/>
+            <w:tcMar>
+              <w:top w:w="0" w:type="dxa"/>
+              <w:bottom w:w="0" w:type="dxa"/>
+              <w:left w:w="0" w:type="dxa"/>
+              <w:right w:w="0" w:type="dxa"/>
+            </w:tcMar>
+            <w:vAlign w:val="center"/>
+          </w:tcPr>
+          <w:p>
+            <w:pPr>
+              <w:pStyle w:val="Normal"/>
+              <w:jc w:val="right"/>
+              <w:pBdr>
+                <w:bottom w:val="none" w:sz="0" w:space="0" w:color="000000"/>
+                <w:top w:val="none" w:sz="0" w:space="0" w:color="000000"/>
+                <w:left w:val="none" w:sz="0" w:space="0" w:color="000000"/>
+                <w:right w:val="none" w:sz="0" w:space="0" w:color="000000"/>
+              </w:pBdr>
+              <w:spacing w:after="100" w:before="100" w:line="240"/>
+              <w:ind w:left="100" w:right="100" w:firstLine="0" w:firstLineChars="0"/>
+              <w:rPr>
+                <w:rFonts w:ascii="DejaVu Sans" w:hAnsi="DejaVu Sans" w:eastAsia="DejaVu Sans" w:cs="DejaVu Sans"/>
+                <w:i w:val="false"/>
+                <w:b w:val="false"/>
+                <w:u w:val="none"/>
+                <w:sz w:val="22"/>
+                <w:szCs w:val="22"/>
+                <w:color w:val="000000"/>
+              </w:rPr>
+            </w:pPr>
+            <w:r xmlns:w="http://schemas.openxmlformats.org/wordprocessingml/2006/main" xmlns:wp="http://schemas.openxmlformats.org/drawingml/2006/wordprocessingDrawing" xmlns:r="http://schemas.openxmlformats.org/officeDocument/2006/relationships" xmlns:w14="http://schemas.microsoft.com/office/word/2010/wordml">
+              <w:rPr>
+                <w:rFonts w:ascii="DejaVu Sans" w:hAnsi="DejaVu Sans" w:eastAsia="DejaVu Sans" w:cs="DejaVu Sans"/>
+                <w:i w:val="false"/>
+                <w:b w:val="false"/>
+                <w:u w:val="none"/>
+                <w:sz w:val="22"/>
+                <w:szCs w:val="22"/>
+                <w:color w:val="000000"/>
+              </w:rPr>
+              <w:t xml:space="preserve">1.3440</w:t>
+            </w:r>
+          </w:p>
+        </w:tc>
+        <w:tc>
+          <w:tcPr>
+            <w:tcBorders>
+              <w:bottom w:val="single" w:sz="12" w:space="0" w:color="666666"/>
+              <w:top w:val="none" w:sz="0" w:space="0" w:color="000000"/>
+              <w:left w:val="none" w:sz="0" w:space="0" w:color="000000"/>
+              <w:right w:val="none" w:sz="0" w:space="0" w:color="000000"/>
+            </w:tcBorders>
+            <w:shd w:val="clear" w:color="auto" w:fill="FFFFFF"/>
+            <w:tcMar>
+              <w:top w:w="0" w:type="dxa"/>
+              <w:bottom w:w="0" w:type="dxa"/>
+              <w:left w:w="0" w:type="dxa"/>
+              <w:right w:w="0" w:type="dxa"/>
+            </w:tcMar>
+            <w:vAlign w:val="center"/>
+          </w:tcPr>
+          <w:p>
+            <w:pPr>
+              <w:pStyle w:val="Normal"/>
+              <w:jc w:val="right"/>
+              <w:pBdr>
+                <w:bottom w:val="none" w:sz="0" w:space="0" w:color="000000"/>
+                <w:top w:val="none" w:sz="0" w:space="0" w:color="000000"/>
+                <w:left w:val="none" w:sz="0" w:space="0" w:color="000000"/>
+                <w:right w:val="none" w:sz="0" w:space="0" w:color="000000"/>
+              </w:pBdr>
+              <w:spacing w:after="100" w:before="100" w:line="240"/>
+              <w:ind w:left="100" w:right="100" w:firstLine="0" w:firstLineChars="0"/>
+              <w:rPr>
+                <w:rFonts w:ascii="DejaVu Sans" w:hAnsi="DejaVu Sans" w:eastAsia="DejaVu Sans" w:cs="DejaVu Sans"/>
+                <w:i w:val="false"/>
+                <w:b w:val="false"/>
+                <w:u w:val="none"/>
+                <w:sz w:val="22"/>
+                <w:szCs w:val="22"/>
+                <w:color w:val="000000"/>
+              </w:rPr>
+            </w:pPr>
+            <w:r xmlns:w="http://schemas.openxmlformats.org/wordprocessingml/2006/main" xmlns:wp="http://schemas.openxmlformats.org/drawingml/2006/wordprocessingDrawing" xmlns:r="http://schemas.openxmlformats.org/officeDocument/2006/relationships" xmlns:w14="http://schemas.microsoft.com/office/word/2010/wordml">
+              <w:rPr>
+                <w:rFonts w:ascii="DejaVu Sans" w:hAnsi="DejaVu Sans" w:eastAsia="DejaVu Sans" w:cs="DejaVu Sans"/>
+                <w:i w:val="false"/>
+                <w:b w:val="false"/>
+                <w:u w:val="none"/>
+                <w:sz w:val="22"/>
+                <w:szCs w:val="22"/>
+                <w:color w:val="000000"/>
+              </w:rPr>
+              <w:t xml:space="preserve">3.8540</w:t>
+            </w:r>
+          </w:p>
+        </w:tc>
+        <w:tc>
+          <w:tcPr>
+            <w:tcBorders>
+              <w:bottom w:val="single" w:sz="12" w:space="0" w:color="666666"/>
+              <w:top w:val="none" w:sz="0" w:space="0" w:color="000000"/>
+              <w:left w:val="none" w:sz="0" w:space="0" w:color="000000"/>
+              <w:right w:val="none" w:sz="0" w:space="0" w:color="000000"/>
+            </w:tcBorders>
+            <w:shd w:val="clear" w:color="auto" w:fill="FFFFFF"/>
+            <w:tcMar>
+              <w:top w:w="0" w:type="dxa"/>
+              <w:bottom w:w="0" w:type="dxa"/>
+              <w:left w:w="0" w:type="dxa"/>
+              <w:right w:w="0" w:type="dxa"/>
+            </w:tcMar>
+            <w:vAlign w:val="center"/>
+          </w:tcPr>
+          <w:p>
+            <w:pPr>
+              <w:pStyle w:val="Normal"/>
+              <w:jc w:val="right"/>
+              <w:pBdr>
+                <w:bottom w:val="none" w:sz="0" w:space="0" w:color="000000"/>
+                <w:top w:val="none" w:sz="0" w:space="0" w:color="000000"/>
+                <w:left w:val="none" w:sz="0" w:space="0" w:color="000000"/>
+                <w:right w:val="none" w:sz="0" w:space="0" w:color="000000"/>
+              </w:pBdr>
+              <w:spacing w:after="100" w:before="100" w:line="240"/>
+              <w:ind w:left="100" w:right="100" w:firstLine="0" w:firstLineChars="0"/>
+              <w:rPr>
+                <w:rFonts w:ascii="DejaVu Sans" w:hAnsi="DejaVu Sans" w:eastAsia="DejaVu Sans" w:cs="DejaVu Sans"/>
+                <w:i w:val="false"/>
+                <w:b w:val="false"/>
+                <w:u w:val="none"/>
+                <w:sz w:val="22"/>
+                <w:szCs w:val="22"/>
+                <w:color w:val="000000"/>
+              </w:rPr>
+            </w:pPr>
+            <w:r xmlns:w="http://schemas.openxmlformats.org/wordprocessingml/2006/main" xmlns:wp="http://schemas.openxmlformats.org/drawingml/2006/wordprocessingDrawing" xmlns:r="http://schemas.openxmlformats.org/officeDocument/2006/relationships" xmlns:w14="http://schemas.microsoft.com/office/word/2010/wordml">
+              <w:rPr>
+                <w:rFonts w:ascii="DejaVu Sans" w:hAnsi="DejaVu Sans" w:eastAsia="DejaVu Sans" w:cs="DejaVu Sans"/>
+                <w:i w:val="false"/>
+                <w:b w:val="false"/>
+                <w:u w:val="none"/>
+                <w:sz w:val="22"/>
+                <w:szCs w:val="22"/>
+                <w:color w:val="000000"/>
+              </w:rPr>
+              <w:t xml:space="preserve">0.9986</w:t>
+            </w:r>
+          </w:p>
+        </w:tc>
+        <w:tc>
+          <w:tcPr>
+            <w:tcBorders>
+              <w:bottom w:val="single" w:sz="12" w:space="0" w:color="666666"/>
+              <w:top w:val="none" w:sz="0" w:space="0" w:color="000000"/>
+              <w:left w:val="none" w:sz="0" w:space="0" w:color="000000"/>
+              <w:right w:val="none" w:sz="0" w:space="0" w:color="000000"/>
+            </w:tcBorders>
+            <w:shd w:val="clear" w:color="auto" w:fill="FFFFFF"/>
+            <w:tcMar>
+              <w:top w:w="0" w:type="dxa"/>
+              <w:bottom w:w="0" w:type="dxa"/>
+              <w:left w:w="0" w:type="dxa"/>
+              <w:right w:w="0" w:type="dxa"/>
+            </w:tcMar>
+            <w:vAlign w:val="center"/>
+          </w:tcPr>
+          <w:p>
+            <w:pPr>
+              <w:pStyle w:val="Normal"/>
+              <w:jc w:val="right"/>
+              <w:pBdr>
+                <w:bottom w:val="none" w:sz="0" w:space="0" w:color="000000"/>
+                <w:top w:val="none" w:sz="0" w:space="0" w:color="000000"/>
+                <w:left w:val="none" w:sz="0" w:space="0" w:color="000000"/>
+                <w:right w:val="none" w:sz="0" w:space="0" w:color="000000"/>
+              </w:pBdr>
+              <w:spacing w:after="100" w:before="100" w:line="240"/>
+              <w:ind w:left="100" w:right="100" w:firstLine="0" w:firstLineChars="0"/>
+              <w:rPr>
+                <w:rFonts w:ascii="DejaVu Sans" w:hAnsi="DejaVu Sans" w:eastAsia="DejaVu Sans" w:cs="DejaVu Sans"/>
+                <w:i w:val="false"/>
+                <w:b w:val="false"/>
+                <w:u w:val="none"/>
+                <w:sz w:val="22"/>
+                <w:szCs w:val="22"/>
+                <w:color w:val="000000"/>
+              </w:rPr>
+            </w:pPr>
+            <w:r xmlns:w="http://schemas.openxmlformats.org/wordprocessingml/2006/main" xmlns:wp="http://schemas.openxmlformats.org/drawingml/2006/wordprocessingDrawing" xmlns:r="http://schemas.openxmlformats.org/officeDocument/2006/relationships" xmlns:w14="http://schemas.microsoft.com/office/word/2010/wordml">
+              <w:rPr>
+                <w:rFonts w:ascii="DejaVu Sans" w:hAnsi="DejaVu Sans" w:eastAsia="DejaVu Sans" w:cs="DejaVu Sans"/>
+                <w:i w:val="false"/>
+                <w:b w:val="false"/>
+                <w:u w:val="none"/>
+                <w:sz w:val="22"/>
+                <w:szCs w:val="22"/>
+                <w:color w:val="000000"/>
+              </w:rPr>
+              <w:t xml:space="preserve">4.0685</w:t>
+            </w:r>
+          </w:p>
+        </w:tc>
+        <w:tc>
+          <w:tcPr>
+            <w:tcBorders>
+              <w:bottom w:val="single" w:sz="12" w:space="0" w:color="666666"/>
+              <w:top w:val="none" w:sz="0" w:space="0" w:color="000000"/>
+              <w:left w:val="none" w:sz="0" w:space="0" w:color="000000"/>
+              <w:right w:val="none" w:sz="0" w:space="0" w:color="000000"/>
+            </w:tcBorders>
+            <w:shd w:val="clear" w:color="auto" w:fill="FFFFFF"/>
+            <w:tcMar>
+              <w:top w:w="0" w:type="dxa"/>
+              <w:bottom w:w="0" w:type="dxa"/>
+              <w:left w:w="0" w:type="dxa"/>
+              <w:right w:w="0" w:type="dxa"/>
+            </w:tcMar>
+            <w:vAlign w:val="center"/>
+          </w:tcPr>
+          <w:p>
+            <w:pPr>
+              <w:pStyle w:val="Normal"/>
+              <w:jc w:val="right"/>
+              <w:pBdr>
+                <w:bottom w:val="none" w:sz="0" w:space="0" w:color="000000"/>
+                <w:top w:val="none" w:sz="0" w:space="0" w:color="000000"/>
+                <w:left w:val="none" w:sz="0" w:space="0" w:color="000000"/>
+                <w:right w:val="none" w:sz="0" w:space="0" w:color="000000"/>
+              </w:pBdr>
+              <w:spacing w:after="100" w:before="100" w:line="240"/>
+              <w:ind w:left="100" w:right="100" w:firstLine="0" w:firstLineChars="0"/>
+              <w:rPr>
+                <w:rFonts w:ascii="DejaVu Sans" w:hAnsi="DejaVu Sans" w:eastAsia="DejaVu Sans" w:cs="DejaVu Sans"/>
+                <w:i w:val="false"/>
+                <w:b w:val="false"/>
+                <w:u w:val="none"/>
+                <w:sz w:val="22"/>
+                <w:szCs w:val="22"/>
+                <w:color w:val="000000"/>
+              </w:rPr>
+            </w:pPr>
+            <w:r xmlns:w="http://schemas.openxmlformats.org/wordprocessingml/2006/main" xmlns:wp="http://schemas.openxmlformats.org/drawingml/2006/wordprocessingDrawing" xmlns:r="http://schemas.openxmlformats.org/officeDocument/2006/relationships" xmlns:w14="http://schemas.microsoft.com/office/word/2010/wordml">
+              <w:rPr>
+                <w:rFonts w:ascii="DejaVu Sans" w:hAnsi="DejaVu Sans" w:eastAsia="DejaVu Sans" w:cs="DejaVu Sans"/>
+                <w:i w:val="false"/>
+                <w:b w:val="false"/>
+                <w:u w:val="none"/>
+                <w:sz w:val="22"/>
+                <w:szCs w:val="22"/>
+                <w:color w:val="000000"/>
+              </w:rPr>
+              <w:t xml:space="preserve">2.0064</w:t>
+            </w:r>
+          </w:p>
+        </w:tc>
+        <w:tc>
+          <w:tcPr>
+            <w:tcBorders>
+              <w:bottom w:val="single" w:sz="12" w:space="0" w:color="666666"/>
+              <w:top w:val="none" w:sz="0" w:space="0" w:color="000000"/>
+              <w:left w:val="none" w:sz="0" w:space="0" w:color="000000"/>
+              <w:right w:val="none" w:sz="0" w:space="0" w:color="000000"/>
+            </w:tcBorders>
+            <w:shd w:val="clear" w:color="auto" w:fill="FFFFFF"/>
+            <w:tcMar>
+              <w:top w:w="0" w:type="dxa"/>
+              <w:bottom w:w="0" w:type="dxa"/>
+              <w:left w:w="0" w:type="dxa"/>
+              <w:right w:w="0" w:type="dxa"/>
+            </w:tcMar>
+            <w:vAlign w:val="center"/>
+          </w:tcPr>
+          <w:p>
+            <w:pPr>
+              <w:pStyle w:val="Normal"/>
+              <w:jc w:val="right"/>
+              <w:pBdr>
+                <w:bottom w:val="none" w:sz="0" w:space="0" w:color="000000"/>
+                <w:top w:val="none" w:sz="0" w:space="0" w:color="000000"/>
+                <w:left w:val="none" w:sz="0" w:space="0" w:color="000000"/>
+                <w:right w:val="none" w:sz="0" w:space="0" w:color="000000"/>
+              </w:pBdr>
+              <w:spacing w:after="100" w:before="100" w:line="240"/>
+              <w:ind w:left="100" w:right="100" w:firstLine="0" w:firstLineChars="0"/>
+              <w:rPr>
+                <w:rFonts w:ascii="DejaVu Sans" w:hAnsi="DejaVu Sans" w:eastAsia="DejaVu Sans" w:cs="DejaVu Sans"/>
+                <w:i w:val="false"/>
+                <w:b w:val="false"/>
+                <w:u w:val="none"/>
+                <w:sz w:val="22"/>
+                <w:szCs w:val="22"/>
+                <w:color w:val="000000"/>
+              </w:rPr>
+            </w:pPr>
+            <w:r xmlns:w="http://schemas.openxmlformats.org/wordprocessingml/2006/main" xmlns:wp="http://schemas.openxmlformats.org/drawingml/2006/wordprocessingDrawing" xmlns:r="http://schemas.openxmlformats.org/officeDocument/2006/relationships" xmlns:w14="http://schemas.microsoft.com/office/word/2010/wordml">
+              <w:rPr>
+                <w:rFonts w:ascii="DejaVu Sans" w:hAnsi="DejaVu Sans" w:eastAsia="DejaVu Sans" w:cs="DejaVu Sans"/>
+                <w:i w:val="false"/>
+                <w:b w:val="false"/>
+                <w:u w:val="none"/>
+                <w:sz w:val="22"/>
+                <w:szCs w:val="22"/>
+                <w:color w:val="000000"/>
+              </w:rPr>
+              <w:t xml:space="preserve">7.8030</w:t>
+            </w:r>
+          </w:p>
+        </w:tc>
+      </w:tr>
+      <w:tr>
+        <w:trPr>
+          <w:trHeight w:val="360" w:hRule="auto"/>
+        </w:trPr>
+        footer1
+        <w:tc>
+          <w:tcPr>
+            <w:gridSpan w:val="9"/>
+            <w:tcBorders>
+              <w:bottom w:val="none" w:sz="0" w:space="0" w:color="FFFFFF"/>
+              <w:top w:val="single" w:sz="12" w:space="0" w:color="666666"/>
+              <w:left w:val="none" w:sz="0" w:space="0" w:color="FFFFFF"/>
+              <w:right w:val="none" w:sz="0" w:space="0" w:color="FFFFFF"/>
+            </w:tcBorders>
+            <w:shd w:val="clear" w:color="auto" w:fill="FFFFFF"/>
+            <w:tcMar>
+              <w:top w:w="0" w:type="dxa"/>
+              <w:bottom w:w="0" w:type="dxa"/>
+              <w:left w:w="0" w:type="dxa"/>
+              <w:right w:w="0" w:type="dxa"/>
+            </w:tcMar>
+            <w:vAlign w:val="center"/>
+          </w:tcPr>
+          <w:p>
+            <w:pPr>
+              <w:pStyle w:val="Normal"/>
+              <w:jc w:val="left"/>
+              <w:pBdr>
+                <w:bottom w:val="none" w:sz="0" w:space="0" w:color="000000"/>
+                <w:top w:val="none" w:sz="0" w:space="0" w:color="000000"/>
+                <w:left w:val="none" w:sz="0" w:space="0" w:color="000000"/>
+                <w:right w:val="none" w:sz="0" w:space="0" w:color="000000"/>
+              </w:pBdr>
+              <w:spacing w:after="100" w:before="100" w:line="240"/>
+              <w:ind w:left="100" w:right="100" w:firstLine="0" w:firstLineChars="0"/>
+              <w:rPr>
+                <w:rFonts w:ascii="DejaVu Sans" w:hAnsi="DejaVu Sans" w:eastAsia="DejaVu Sans" w:cs="DejaVu Sans"/>
+                <w:i w:val="false"/>
+                <w:b w:val="false"/>
+                <w:u w:val="none"/>
+                <w:sz w:val="22"/>
+                <w:szCs w:val="22"/>
+                <w:color w:val="000000"/>
+              </w:rPr>
+            </w:pPr>
+            <w:r xmlns:w="http://schemas.openxmlformats.org/wordprocessingml/2006/main" xmlns:wp="http://schemas.openxmlformats.org/drawingml/2006/wordprocessingDrawing" xmlns:r="http://schemas.openxmlformats.org/officeDocument/2006/relationships" xmlns:w14="http://schemas.microsoft.com/office/word/2010/wordml">
+              <w:rPr>
+                <w:rFonts w:ascii="DejaVu Sans" w:hAnsi="DejaVu Sans" w:eastAsia="DejaVu Sans" w:cs="DejaVu Sans"/>
+                <w:i w:val="false"/>
+                <w:b w:val="false"/>
+                <w:u w:val="none"/>
+                <w:sz w:val="22"/>
+                <w:szCs w:val="22"/>
+                <w:color w:val="000000"/>
+              </w:rPr>
+              <w:t xml:space="preserve">Realizada porque no pudo confirmarse documentalmente si 2024 corresponde a un año completo de registro institucional.</w:t>
             </w:r>
           </w:p>
         </w:tc>
@@ -34674,7 +36444,7 @@
               <a:graphicData uri="http://schemas.openxmlformats.org/drawingml/2006/picture">
                 <pic:pic>
                   <pic:nvPicPr>
-                    <pic:cNvPr descr="articulo_maestro_files/figures/articulo/figura_s1_ppc_modelo_final.png" id="48" name="Picture"/>
+                    <pic:cNvPr descr="figures/articulo/figura_s1_ppc_modelo_final.png" id="48" name="Picture"/>
                     <pic:cNvPicPr>
                       <a:picLocks noChangeArrowheads="1" noChangeAspect="1"/>
                     </pic:cNvPicPr>
@@ -34729,7 +36499,7 @@
               <a:graphicData uri="http://schemas.openxmlformats.org/drawingml/2006/picture">
                 <pic:pic>
                   <pic:nvPicPr>
-                    <pic:cNvPr descr="articulo_maestro_files/figures/articulo/figura_dag_conceptual.png" id="51" name="Picture"/>
+                    <pic:cNvPr descr="figures/articulo/figura_dag_conceptual.png" id="51" name="Picture"/>
                     <pic:cNvPicPr>
                       <a:picLocks noChangeArrowheads="1" noChangeAspect="1"/>
                     </pic:cNvPicPr>

</xml_diff>